<commit_message>
arregklo de large class persistencia
</commit_message>
<xml_diff>
--- a/docs/Documento de Requerimientos - Grupo 10 - Segunda Entrega.docx
+++ b/docs/Documento de Requerimientos - Grupo 10 - Segunda Entrega.docx
@@ -551,7 +551,6 @@
               <w:kern w:val="2"/>
               <w:sz w:val="24"/>
               <w:szCs w:val="24"/>
-              <w:lang w:val="en-US" w:eastAsia="en-US"/>
               <w14:ligatures w14:val="standardContextual"/>
             </w:rPr>
           </w:pPr>
@@ -564,7 +563,7 @@
           <w:r>
             <w:fldChar w:fldCharType="separate"/>
           </w:r>
-          <w:hyperlink w:anchor="_Toc242618214" w:history="1">
+          <w:hyperlink w:anchor="_Toc243836799" w:history="1">
             <w:r>
               <w:rPr>
                 <w:rStyle w:val="Hyperlink"/>
@@ -588,7 +587,7 @@
               <w:rPr>
                 <w:noProof/>
               </w:rPr>
-              <w:instrText xml:space="preserve"> PAGEREF _Toc242618214 \h </w:instrText>
+              <w:instrText xml:space="preserve"> PAGEREF _Toc243836799 \h </w:instrText>
             </w:r>
             <w:r>
               <w:rPr>
@@ -627,11 +626,10 @@
               <w:kern w:val="2"/>
               <w:sz w:val="24"/>
               <w:szCs w:val="24"/>
-              <w:lang w:val="en-US" w:eastAsia="en-US"/>
               <w14:ligatures w14:val="standardContextual"/>
             </w:rPr>
           </w:pPr>
-          <w:hyperlink w:anchor="_Toc242618215" w:history="1">
+          <w:hyperlink w:anchor="_Toc243836800" w:history="1">
             <w:r>
               <w:rPr>
                 <w:rStyle w:val="Hyperlink"/>
@@ -655,7 +653,7 @@
               <w:rPr>
                 <w:noProof/>
               </w:rPr>
-              <w:instrText xml:space="preserve"> PAGEREF _Toc242618215 \h </w:instrText>
+              <w:instrText xml:space="preserve"> PAGEREF _Toc243836800 \h </w:instrText>
             </w:r>
             <w:r>
               <w:rPr>
@@ -694,11 +692,10 @@
               <w:kern w:val="2"/>
               <w:sz w:val="24"/>
               <w:szCs w:val="24"/>
-              <w:lang w:val="en-US" w:eastAsia="en-US"/>
               <w14:ligatures w14:val="standardContextual"/>
             </w:rPr>
           </w:pPr>
-          <w:hyperlink w:anchor="_Toc242618216" w:history="1">
+          <w:hyperlink w:anchor="_Toc243836801" w:history="1">
             <w:r>
               <w:rPr>
                 <w:rStyle w:val="Hyperlink"/>
@@ -722,7 +719,7 @@
               <w:rPr>
                 <w:noProof/>
               </w:rPr>
-              <w:instrText xml:space="preserve"> PAGEREF _Toc242618216 \h </w:instrText>
+              <w:instrText xml:space="preserve"> PAGEREF _Toc243836801 \h </w:instrText>
             </w:r>
             <w:r>
               <w:rPr>
@@ -761,11 +758,10 @@
               <w:kern w:val="2"/>
               <w:sz w:val="24"/>
               <w:szCs w:val="24"/>
-              <w:lang w:val="en-US" w:eastAsia="en-US"/>
               <w14:ligatures w14:val="standardContextual"/>
             </w:rPr>
           </w:pPr>
-          <w:hyperlink w:anchor="_Toc242618217" w:history="1">
+          <w:hyperlink w:anchor="_Toc243836802" w:history="1">
             <w:r>
               <w:rPr>
                 <w:rStyle w:val="Hyperlink"/>
@@ -789,7 +785,7 @@
               <w:rPr>
                 <w:noProof/>
               </w:rPr>
-              <w:instrText xml:space="preserve"> PAGEREF _Toc242618217 \h </w:instrText>
+              <w:instrText xml:space="preserve"> PAGEREF _Toc243836802 \h </w:instrText>
             </w:r>
             <w:r>
               <w:rPr>
@@ -828,11 +824,10 @@
               <w:kern w:val="2"/>
               <w:sz w:val="24"/>
               <w:szCs w:val="24"/>
-              <w:lang w:val="en-US" w:eastAsia="en-US"/>
               <w14:ligatures w14:val="standardContextual"/>
             </w:rPr>
           </w:pPr>
-          <w:hyperlink w:anchor="_Toc242618218" w:history="1">
+          <w:hyperlink w:anchor="_Toc243836803" w:history="1">
             <w:r>
               <w:rPr>
                 <w:rStyle w:val="Hyperlink"/>
@@ -856,7 +851,7 @@
               <w:rPr>
                 <w:noProof/>
               </w:rPr>
-              <w:instrText xml:space="preserve"> PAGEREF _Toc242618218 \h </w:instrText>
+              <w:instrText xml:space="preserve"> PAGEREF _Toc243836803 \h </w:instrText>
             </w:r>
             <w:r>
               <w:rPr>
@@ -895,11 +890,10 @@
               <w:kern w:val="2"/>
               <w:sz w:val="24"/>
               <w:szCs w:val="24"/>
-              <w:lang w:val="en-US" w:eastAsia="en-US"/>
               <w14:ligatures w14:val="standardContextual"/>
             </w:rPr>
           </w:pPr>
-          <w:hyperlink w:anchor="_Toc242618219" w:history="1">
+          <w:hyperlink w:anchor="_Toc243836804" w:history="1">
             <w:r>
               <w:rPr>
                 <w:rStyle w:val="Hyperlink"/>
@@ -923,7 +917,7 @@
               <w:rPr>
                 <w:noProof/>
               </w:rPr>
-              <w:instrText xml:space="preserve"> PAGEREF _Toc242618219 \h </w:instrText>
+              <w:instrText xml:space="preserve"> PAGEREF _Toc243836804 \h </w:instrText>
             </w:r>
             <w:r>
               <w:rPr>
@@ -962,11 +956,10 @@
               <w:kern w:val="2"/>
               <w:sz w:val="24"/>
               <w:szCs w:val="24"/>
-              <w:lang w:val="en-US" w:eastAsia="en-US"/>
               <w14:ligatures w14:val="standardContextual"/>
             </w:rPr>
           </w:pPr>
-          <w:hyperlink w:anchor="_Toc242618220" w:history="1">
+          <w:hyperlink w:anchor="_Toc243836805" w:history="1">
             <w:r>
               <w:rPr>
                 <w:rStyle w:val="Hyperlink"/>
@@ -990,7 +983,7 @@
               <w:rPr>
                 <w:noProof/>
               </w:rPr>
-              <w:instrText xml:space="preserve"> PAGEREF _Toc242618220 \h </w:instrText>
+              <w:instrText xml:space="preserve"> PAGEREF _Toc243836805 \h </w:instrText>
             </w:r>
             <w:r>
               <w:rPr>
@@ -1029,11 +1022,10 @@
               <w:kern w:val="2"/>
               <w:sz w:val="24"/>
               <w:szCs w:val="24"/>
-              <w:lang w:val="en-US" w:eastAsia="en-US"/>
               <w14:ligatures w14:val="standardContextual"/>
             </w:rPr>
           </w:pPr>
-          <w:hyperlink w:anchor="_Toc242618221" w:history="1">
+          <w:hyperlink w:anchor="_Toc243836806" w:history="1">
             <w:r>
               <w:rPr>
                 <w:rStyle w:val="Hyperlink"/>
@@ -1057,7 +1049,7 @@
               <w:rPr>
                 <w:noProof/>
               </w:rPr>
-              <w:instrText xml:space="preserve"> PAGEREF _Toc242618221 \h </w:instrText>
+              <w:instrText xml:space="preserve"> PAGEREF _Toc243836806 \h </w:instrText>
             </w:r>
             <w:r>
               <w:rPr>
@@ -1096,11 +1088,10 @@
               <w:kern w:val="2"/>
               <w:sz w:val="24"/>
               <w:szCs w:val="24"/>
-              <w:lang w:val="en-US" w:eastAsia="en-US"/>
               <w14:ligatures w14:val="standardContextual"/>
             </w:rPr>
           </w:pPr>
-          <w:hyperlink w:anchor="_Toc242618222" w:history="1">
+          <w:hyperlink w:anchor="_Toc243836807" w:history="1">
             <w:r>
               <w:rPr>
                 <w:rStyle w:val="Hyperlink"/>
@@ -1124,7 +1115,7 @@
               <w:rPr>
                 <w:noProof/>
               </w:rPr>
-              <w:instrText xml:space="preserve"> PAGEREF _Toc242618222 \h </w:instrText>
+              <w:instrText xml:space="preserve"> PAGEREF _Toc243836807 \h </w:instrText>
             </w:r>
             <w:r>
               <w:rPr>
@@ -1163,11 +1154,10 @@
               <w:kern w:val="2"/>
               <w:sz w:val="24"/>
               <w:szCs w:val="24"/>
-              <w:lang w:val="en-US" w:eastAsia="en-US"/>
               <w14:ligatures w14:val="standardContextual"/>
             </w:rPr>
           </w:pPr>
-          <w:hyperlink w:anchor="_Toc242618223" w:history="1">
+          <w:hyperlink w:anchor="_Toc243836808" w:history="1">
             <w:r>
               <w:rPr>
                 <w:rStyle w:val="Hyperlink"/>
@@ -1191,7 +1181,7 @@
               <w:rPr>
                 <w:noProof/>
               </w:rPr>
-              <w:instrText xml:space="preserve"> PAGEREF _Toc242618223 \h </w:instrText>
+              <w:instrText xml:space="preserve"> PAGEREF _Toc243836808 \h </w:instrText>
             </w:r>
             <w:r>
               <w:rPr>
@@ -1230,11 +1220,10 @@
               <w:kern w:val="2"/>
               <w:sz w:val="24"/>
               <w:szCs w:val="24"/>
-              <w:lang w:val="en-US" w:eastAsia="en-US"/>
               <w14:ligatures w14:val="standardContextual"/>
             </w:rPr>
           </w:pPr>
-          <w:hyperlink w:anchor="_Toc242618224" w:history="1">
+          <w:hyperlink w:anchor="_Toc243836809" w:history="1">
             <w:r>
               <w:rPr>
                 <w:rStyle w:val="Hyperlink"/>
@@ -1258,7 +1247,7 @@
               <w:rPr>
                 <w:noProof/>
               </w:rPr>
-              <w:instrText xml:space="preserve"> PAGEREF _Toc242618224 \h </w:instrText>
+              <w:instrText xml:space="preserve"> PAGEREF _Toc243836809 \h </w:instrText>
             </w:r>
             <w:r>
               <w:rPr>
@@ -1297,11 +1286,10 @@
               <w:kern w:val="2"/>
               <w:sz w:val="24"/>
               <w:szCs w:val="24"/>
-              <w:lang w:val="en-US" w:eastAsia="en-US"/>
               <w14:ligatures w14:val="standardContextual"/>
             </w:rPr>
           </w:pPr>
-          <w:hyperlink w:anchor="_Toc242618225" w:history="1">
+          <w:hyperlink w:anchor="_Toc243836810" w:history="1">
             <w:r>
               <w:rPr>
                 <w:rStyle w:val="Hyperlink"/>
@@ -1325,7 +1313,7 @@
               <w:rPr>
                 <w:noProof/>
               </w:rPr>
-              <w:instrText xml:space="preserve"> PAGEREF _Toc242618225 \h </w:instrText>
+              <w:instrText xml:space="preserve"> PAGEREF _Toc243836810 \h </w:instrText>
             </w:r>
             <w:r>
               <w:rPr>
@@ -1364,11 +1352,10 @@
               <w:kern w:val="2"/>
               <w:sz w:val="24"/>
               <w:szCs w:val="24"/>
-              <w:lang w:val="en-US" w:eastAsia="en-US"/>
               <w14:ligatures w14:val="standardContextual"/>
             </w:rPr>
           </w:pPr>
-          <w:hyperlink w:anchor="_Toc242618226" w:history="1">
+          <w:hyperlink w:anchor="_Toc243836811" w:history="1">
             <w:r>
               <w:rPr>
                 <w:rStyle w:val="Hyperlink"/>
@@ -1392,7 +1379,7 @@
               <w:rPr>
                 <w:noProof/>
               </w:rPr>
-              <w:instrText xml:space="preserve"> PAGEREF _Toc242618226 \h </w:instrText>
+              <w:instrText xml:space="preserve"> PAGEREF _Toc243836811 \h </w:instrText>
             </w:r>
             <w:r>
               <w:rPr>
@@ -1431,11 +1418,10 @@
               <w:kern w:val="2"/>
               <w:sz w:val="24"/>
               <w:szCs w:val="24"/>
-              <w:lang w:val="en-US" w:eastAsia="en-US"/>
               <w14:ligatures w14:val="standardContextual"/>
             </w:rPr>
           </w:pPr>
-          <w:hyperlink w:anchor="_Toc242618227" w:history="1">
+          <w:hyperlink w:anchor="_Toc243836812" w:history="1">
             <w:r>
               <w:rPr>
                 <w:rStyle w:val="Hyperlink"/>
@@ -1459,7 +1445,7 @@
               <w:rPr>
                 <w:noProof/>
               </w:rPr>
-              <w:instrText xml:space="preserve"> PAGEREF _Toc242618227 \h </w:instrText>
+              <w:instrText xml:space="preserve"> PAGEREF _Toc243836812 \h </w:instrText>
             </w:r>
             <w:r>
               <w:rPr>
@@ -1498,11 +1484,10 @@
               <w:kern w:val="2"/>
               <w:sz w:val="24"/>
               <w:szCs w:val="24"/>
-              <w:lang w:val="en-US" w:eastAsia="en-US"/>
               <w14:ligatures w14:val="standardContextual"/>
             </w:rPr>
           </w:pPr>
-          <w:hyperlink w:anchor="_Toc242618228" w:history="1">
+          <w:hyperlink w:anchor="_Toc243836813" w:history="1">
             <w:r>
               <w:rPr>
                 <w:rStyle w:val="Hyperlink"/>
@@ -1526,7 +1511,7 @@
               <w:rPr>
                 <w:noProof/>
               </w:rPr>
-              <w:instrText xml:space="preserve"> PAGEREF _Toc242618228 \h </w:instrText>
+              <w:instrText xml:space="preserve"> PAGEREF _Toc243836813 \h </w:instrText>
             </w:r>
             <w:r>
               <w:rPr>
@@ -1565,11 +1550,10 @@
               <w:kern w:val="2"/>
               <w:sz w:val="24"/>
               <w:szCs w:val="24"/>
-              <w:lang w:val="en-US" w:eastAsia="en-US"/>
               <w14:ligatures w14:val="standardContextual"/>
             </w:rPr>
           </w:pPr>
-          <w:hyperlink w:anchor="_Toc242618229" w:history="1">
+          <w:hyperlink w:anchor="_Toc243836814" w:history="1">
             <w:r>
               <w:rPr>
                 <w:rStyle w:val="Hyperlink"/>
@@ -1593,7 +1577,7 @@
               <w:rPr>
                 <w:noProof/>
               </w:rPr>
-              <w:instrText xml:space="preserve"> PAGEREF _Toc242618229 \h </w:instrText>
+              <w:instrText xml:space="preserve"> PAGEREF _Toc243836814 \h </w:instrText>
             </w:r>
             <w:r>
               <w:rPr>
@@ -1610,7 +1594,7 @@
               <w:rPr>
                 <w:noProof/>
               </w:rPr>
-              <w:t>5</w:t>
+              <w:t>6</w:t>
             </w:r>
             <w:r>
               <w:rPr>
@@ -1632,11 +1616,10 @@
               <w:kern w:val="2"/>
               <w:sz w:val="24"/>
               <w:szCs w:val="24"/>
-              <w:lang w:val="en-US" w:eastAsia="en-US"/>
               <w14:ligatures w14:val="standardContextual"/>
             </w:rPr>
           </w:pPr>
-          <w:hyperlink w:anchor="_Toc242618230" w:history="1">
+          <w:hyperlink w:anchor="_Toc243836815" w:history="1">
             <w:r>
               <w:rPr>
                 <w:rStyle w:val="Hyperlink"/>
@@ -1660,7 +1643,7 @@
               <w:rPr>
                 <w:noProof/>
               </w:rPr>
-              <w:instrText xml:space="preserve"> PAGEREF _Toc242618230 \h </w:instrText>
+              <w:instrText xml:space="preserve"> PAGEREF _Toc243836815 \h </w:instrText>
             </w:r>
             <w:r>
               <w:rPr>
@@ -1699,11 +1682,10 @@
               <w:kern w:val="2"/>
               <w:sz w:val="24"/>
               <w:szCs w:val="24"/>
-              <w:lang w:val="en-US" w:eastAsia="en-US"/>
               <w14:ligatures w14:val="standardContextual"/>
             </w:rPr>
           </w:pPr>
-          <w:hyperlink w:anchor="_Toc242618231" w:history="1">
+          <w:hyperlink w:anchor="_Toc243836816" w:history="1">
             <w:r>
               <w:rPr>
                 <w:rStyle w:val="Hyperlink"/>
@@ -1727,7 +1709,7 @@
               <w:rPr>
                 <w:noProof/>
               </w:rPr>
-              <w:instrText xml:space="preserve"> PAGEREF _Toc242618231 \h </w:instrText>
+              <w:instrText xml:space="preserve"> PAGEREF _Toc243836816 \h </w:instrText>
             </w:r>
             <w:r>
               <w:rPr>
@@ -1766,11 +1748,10 @@
               <w:kern w:val="2"/>
               <w:sz w:val="24"/>
               <w:szCs w:val="24"/>
-              <w:lang w:val="en-US" w:eastAsia="en-US"/>
               <w14:ligatures w14:val="standardContextual"/>
             </w:rPr>
           </w:pPr>
-          <w:hyperlink w:anchor="_Toc242618232" w:history="1">
+          <w:hyperlink w:anchor="_Toc243836817" w:history="1">
             <w:r>
               <w:rPr>
                 <w:rStyle w:val="Hyperlink"/>
@@ -1794,7 +1775,7 @@
               <w:rPr>
                 <w:noProof/>
               </w:rPr>
-              <w:instrText xml:space="preserve"> PAGEREF _Toc242618232 \h </w:instrText>
+              <w:instrText xml:space="preserve"> PAGEREF _Toc243836817 \h </w:instrText>
             </w:r>
             <w:r>
               <w:rPr>
@@ -1811,7 +1792,7 @@
               <w:rPr>
                 <w:noProof/>
               </w:rPr>
-              <w:t>6</w:t>
+              <w:t>7</w:t>
             </w:r>
             <w:r>
               <w:rPr>
@@ -1833,11 +1814,10 @@
               <w:kern w:val="2"/>
               <w:sz w:val="24"/>
               <w:szCs w:val="24"/>
-              <w:lang w:val="en-US" w:eastAsia="en-US"/>
               <w14:ligatures w14:val="standardContextual"/>
             </w:rPr>
           </w:pPr>
-          <w:hyperlink w:anchor="_Toc242618233" w:history="1">
+          <w:hyperlink w:anchor="_Toc243836818" w:history="1">
             <w:r>
               <w:rPr>
                 <w:rStyle w:val="Hyperlink"/>
@@ -1861,7 +1841,7 @@
               <w:rPr>
                 <w:noProof/>
               </w:rPr>
-              <w:instrText xml:space="preserve"> PAGEREF _Toc242618233 \h </w:instrText>
+              <w:instrText xml:space="preserve"> PAGEREF _Toc243836818 \h </w:instrText>
             </w:r>
             <w:r>
               <w:rPr>
@@ -1900,11 +1880,10 @@
               <w:kern w:val="2"/>
               <w:sz w:val="24"/>
               <w:szCs w:val="24"/>
-              <w:lang w:val="en-US" w:eastAsia="en-US"/>
               <w14:ligatures w14:val="standardContextual"/>
             </w:rPr>
           </w:pPr>
-          <w:hyperlink w:anchor="_Toc242618234" w:history="1">
+          <w:hyperlink w:anchor="_Toc243836819" w:history="1">
             <w:r>
               <w:rPr>
                 <w:rStyle w:val="Hyperlink"/>
@@ -1928,7 +1907,7 @@
               <w:rPr>
                 <w:noProof/>
               </w:rPr>
-              <w:instrText xml:space="preserve"> PAGEREF _Toc242618234 \h </w:instrText>
+              <w:instrText xml:space="preserve"> PAGEREF _Toc243836819 \h </w:instrText>
             </w:r>
             <w:r>
               <w:rPr>
@@ -1967,11 +1946,10 @@
               <w:kern w:val="2"/>
               <w:sz w:val="24"/>
               <w:szCs w:val="24"/>
-              <w:lang w:val="en-US" w:eastAsia="en-US"/>
               <w14:ligatures w14:val="standardContextual"/>
             </w:rPr>
           </w:pPr>
-          <w:hyperlink w:anchor="_Toc242618235" w:history="1">
+          <w:hyperlink w:anchor="_Toc243836820" w:history="1">
             <w:r>
               <w:rPr>
                 <w:rStyle w:val="Hyperlink"/>
@@ -1995,7 +1973,7 @@
               <w:rPr>
                 <w:noProof/>
               </w:rPr>
-              <w:instrText xml:space="preserve"> PAGEREF _Toc242618235 \h </w:instrText>
+              <w:instrText xml:space="preserve"> PAGEREF _Toc243836820 \h </w:instrText>
             </w:r>
             <w:r>
               <w:rPr>
@@ -2012,7 +1990,7 @@
               <w:rPr>
                 <w:noProof/>
               </w:rPr>
-              <w:t>8</w:t>
+              <w:t>9</w:t>
             </w:r>
             <w:r>
               <w:rPr>
@@ -2034,11 +2012,10 @@
               <w:kern w:val="2"/>
               <w:sz w:val="24"/>
               <w:szCs w:val="24"/>
-              <w:lang w:val="en-US" w:eastAsia="en-US"/>
               <w14:ligatures w14:val="standardContextual"/>
             </w:rPr>
           </w:pPr>
-          <w:hyperlink w:anchor="_TocSegundaEntrega" w:history="1">
+          <w:hyperlink w:anchor="_Toc243836821" w:history="1">
             <w:r>
               <w:rPr>
                 <w:rStyle w:val="Hyperlink"/>
@@ -2062,7 +2039,7 @@
               <w:rPr>
                 <w:noProof/>
               </w:rPr>
-              <w:instrText xml:space="preserve"> PAGEREF _TocSegundaEntrega \h </w:instrText>
+              <w:instrText xml:space="preserve"> PAGEREF _Toc243836821 \h </w:instrText>
             </w:r>
             <w:r>
               <w:rPr>
@@ -2079,7 +2056,7 @@
               <w:rPr>
                 <w:noProof/>
               </w:rPr>
-              <w:t>8</w:t>
+              <w:t>10</w:t>
             </w:r>
             <w:r>
               <w:rPr>
@@ -2101,11 +2078,10 @@
               <w:kern w:val="2"/>
               <w:sz w:val="24"/>
               <w:szCs w:val="24"/>
-              <w:lang w:val="en-US" w:eastAsia="en-US"/>
               <w14:ligatures w14:val="standardContextual"/>
             </w:rPr>
           </w:pPr>
-          <w:hyperlink w:anchor="_TocSegundaEntrega1" w:history="1">
+          <w:hyperlink w:anchor="_Toc243836822" w:history="1">
             <w:r>
               <w:rPr>
                 <w:rStyle w:val="Hyperlink"/>
@@ -2129,7 +2105,7 @@
               <w:rPr>
                 <w:noProof/>
               </w:rPr>
-              <w:instrText xml:space="preserve"> PAGEREF _TocSegundaEntrega1 \h </w:instrText>
+              <w:instrText xml:space="preserve"> PAGEREF _Toc243836822 \h </w:instrText>
             </w:r>
             <w:r>
               <w:rPr>
@@ -2146,7 +2122,7 @@
               <w:rPr>
                 <w:noProof/>
               </w:rPr>
-              <w:t>8</w:t>
+              <w:t>10</w:t>
             </w:r>
             <w:r>
               <w:rPr>
@@ -2168,11 +2144,10 @@
               <w:kern w:val="2"/>
               <w:sz w:val="24"/>
               <w:szCs w:val="24"/>
-              <w:lang w:val="en-US" w:eastAsia="en-US"/>
               <w14:ligatures w14:val="standardContextual"/>
             </w:rPr>
           </w:pPr>
-          <w:hyperlink w:anchor="_TocSegundaEntrega2" w:history="1">
+          <w:hyperlink w:anchor="_Toc243836823" w:history="1">
             <w:r>
               <w:rPr>
                 <w:rStyle w:val="Hyperlink"/>
@@ -2196,7 +2171,7 @@
               <w:rPr>
                 <w:noProof/>
               </w:rPr>
-              <w:instrText xml:space="preserve"> PAGEREF _TocSegundaEntrega2 \h </w:instrText>
+              <w:instrText xml:space="preserve"> PAGEREF _Toc243836823 \h </w:instrText>
             </w:r>
             <w:r>
               <w:rPr>
@@ -2213,7 +2188,7 @@
               <w:rPr>
                 <w:noProof/>
               </w:rPr>
-              <w:t>8</w:t>
+              <w:t>10</w:t>
             </w:r>
             <w:r>
               <w:rPr>
@@ -2235,11 +2210,10 @@
               <w:kern w:val="2"/>
               <w:sz w:val="24"/>
               <w:szCs w:val="24"/>
-              <w:lang w:val="en-US" w:eastAsia="en-US"/>
               <w14:ligatures w14:val="standardContextual"/>
             </w:rPr>
           </w:pPr>
-          <w:hyperlink w:anchor="_TocSegundaEntrega3" w:history="1">
+          <w:hyperlink w:anchor="_Toc243836824" w:history="1">
             <w:r>
               <w:rPr>
                 <w:rStyle w:val="Hyperlink"/>
@@ -2263,7 +2237,7 @@
               <w:rPr>
                 <w:noProof/>
               </w:rPr>
-              <w:instrText xml:space="preserve"> PAGEREF _TocSegundaEntrega3 \h </w:instrText>
+              <w:instrText xml:space="preserve"> PAGEREF _Toc243836824 \h </w:instrText>
             </w:r>
             <w:r>
               <w:rPr>
@@ -2280,7 +2254,7 @@
               <w:rPr>
                 <w:noProof/>
               </w:rPr>
-              <w:t>8</w:t>
+              <w:t>11</w:t>
             </w:r>
             <w:r>
               <w:rPr>
@@ -2302,11 +2276,10 @@
               <w:kern w:val="2"/>
               <w:sz w:val="24"/>
               <w:szCs w:val="24"/>
-              <w:lang w:val="en-US" w:eastAsia="en-US"/>
               <w14:ligatures w14:val="standardContextual"/>
             </w:rPr>
           </w:pPr>
-          <w:hyperlink w:anchor="_TocSegundaEntrega4" w:history="1">
+          <w:hyperlink w:anchor="_Toc243836825" w:history="1">
             <w:r>
               <w:rPr>
                 <w:rStyle w:val="Hyperlink"/>
@@ -2330,7 +2303,7 @@
               <w:rPr>
                 <w:noProof/>
               </w:rPr>
-              <w:instrText xml:space="preserve"> PAGEREF _TocSegundaEntrega4 \h </w:instrText>
+              <w:instrText xml:space="preserve"> PAGEREF _Toc243836825 \h </w:instrText>
             </w:r>
             <w:r>
               <w:rPr>
@@ -2347,7 +2320,7 @@
               <w:rPr>
                 <w:noProof/>
               </w:rPr>
-              <w:t>8</w:t>
+              <w:t>11</w:t>
             </w:r>
             <w:r>
               <w:rPr>
@@ -2369,11 +2342,10 @@
               <w:kern w:val="2"/>
               <w:sz w:val="24"/>
               <w:szCs w:val="24"/>
-              <w:lang w:val="en-US" w:eastAsia="en-US"/>
               <w14:ligatures w14:val="standardContextual"/>
             </w:rPr>
           </w:pPr>
-          <w:hyperlink w:anchor="_Toc242618236" w:history="1">
+          <w:hyperlink w:anchor="_Toc243836826" w:history="1">
             <w:r>
               <w:rPr>
                 <w:rStyle w:val="Hyperlink"/>
@@ -2397,7 +2369,7 @@
               <w:rPr>
                 <w:noProof/>
               </w:rPr>
-              <w:instrText xml:space="preserve"> PAGEREF _Toc242618236 \h </w:instrText>
+              <w:instrText xml:space="preserve"> PAGEREF _Toc243836826 \h </w:instrText>
             </w:r>
             <w:r>
               <w:rPr>
@@ -2414,7 +2386,7 @@
               <w:rPr>
                 <w:noProof/>
               </w:rPr>
-              <w:t>8</w:t>
+              <w:t>11</w:t>
             </w:r>
             <w:r>
               <w:rPr>
@@ -2436,11 +2408,10 @@
               <w:kern w:val="2"/>
               <w:sz w:val="24"/>
               <w:szCs w:val="24"/>
-              <w:lang w:val="en-US" w:eastAsia="en-US"/>
               <w14:ligatures w14:val="standardContextual"/>
             </w:rPr>
           </w:pPr>
-          <w:hyperlink w:anchor="_Toc242618237" w:history="1">
+          <w:hyperlink w:anchor="_Toc243836827" w:history="1">
             <w:r>
               <w:rPr>
                 <w:rStyle w:val="Hyperlink"/>
@@ -2464,7 +2435,7 @@
               <w:rPr>
                 <w:noProof/>
               </w:rPr>
-              <w:instrText xml:space="preserve"> PAGEREF _Toc242618237 \h </w:instrText>
+              <w:instrText xml:space="preserve"> PAGEREF _Toc243836827 \h </w:instrText>
             </w:r>
             <w:r>
               <w:rPr>
@@ -2481,7 +2452,7 @@
               <w:rPr>
                 <w:noProof/>
               </w:rPr>
-              <w:t>8</w:t>
+              <w:t>12</w:t>
             </w:r>
             <w:r>
               <w:rPr>
@@ -2507,7 +2478,7 @@
       <w:pPr>
         <w:pStyle w:val="Heading1"/>
       </w:pPr>
-      <w:bookmarkStart w:id="0" w:name="_Toc242618214"/>
+      <w:bookmarkStart w:id="0" w:name="_Toc243836799"/>
       <w:r>
         <w:lastRenderedPageBreak/>
         <w:t>1. Introducción</w:t>
@@ -2518,7 +2489,7 @@
       <w:pPr>
         <w:pStyle w:val="Heading2"/>
       </w:pPr>
-      <w:bookmarkStart w:id="1" w:name="_Toc242618215"/>
+      <w:bookmarkStart w:id="1" w:name="_Toc243836800"/>
       <w:r>
         <w:t>1.1 Propósito</w:t>
       </w:r>
@@ -2529,14 +2500,14 @@
         <w:spacing w:after="120"/>
       </w:pPr>
       <w:r>
-        <w:t xml:space="preserve">Este documento describe los requerimientos del Sistema de Gestión de Festival de Cine: qué debe hacer el sistema (requerimientos funcionales), qué reglas de negocio debe respetar y bajo qué condiciones técnicas opera (requerimientos no funcionales). Sirve como referencia para entender el alcance del sistema entregado y como base para su análisis de diseño. Esta versión corresponde a la segunda entrega e incluye las correcciones descritas en la sección 7.</w:t>
+        <w:t>Este documento describe los requerimientos del Sistema de Gestión de Festival de Cine: qué debe hacer el sistema (requerimientos funcionales), qué reglas de negocio debe respetar y bajo qué condiciones técnicas opera (requerimientos no funcionales). Sirve como referencia para entender el alcance del sistema entregado y como base para su análisis de diseño. Esta versión corresponde a la segunda entrega e incluye las correcciones descritas en la sección 7.</w:t>
       </w:r>
     </w:p>
     <w:p>
       <w:pPr>
         <w:pStyle w:val="Heading2"/>
       </w:pPr>
-      <w:bookmarkStart w:id="2" w:name="_Toc242618216"/>
+      <w:bookmarkStart w:id="2" w:name="_Toc243836801"/>
       <w:r>
         <w:t>1.2 Alcance</w:t>
       </w:r>
@@ -2562,7 +2533,7 @@
       <w:pPr>
         <w:pStyle w:val="Heading1"/>
       </w:pPr>
-      <w:bookmarkStart w:id="3" w:name="_Toc242618217"/>
+      <w:bookmarkStart w:id="3" w:name="_Toc243836802"/>
       <w:r>
         <w:t>2. Descripción general</w:t>
       </w:r>
@@ -2572,7 +2543,7 @@
       <w:pPr>
         <w:pStyle w:val="Heading2"/>
       </w:pPr>
-      <w:bookmarkStart w:id="4" w:name="_Toc242618218"/>
+      <w:bookmarkStart w:id="4" w:name="_Toc243836803"/>
       <w:r>
         <w:t>2.1 Contexto del problema</w:t>
       </w:r>
@@ -2590,7 +2561,7 @@
       <w:pPr>
         <w:pStyle w:val="Heading2"/>
       </w:pPr>
-      <w:bookmarkStart w:id="5" w:name="_Toc242618219"/>
+      <w:bookmarkStart w:id="5" w:name="_Toc243836804"/>
       <w:r>
         <w:t>2.2 Actores</w:t>
       </w:r>
@@ -2877,7 +2848,7 @@
       <w:pPr>
         <w:pStyle w:val="Heading1"/>
       </w:pPr>
-      <w:bookmarkStart w:id="6" w:name="_Toc242618220"/>
+      <w:bookmarkStart w:id="6" w:name="_Toc243836805"/>
       <w:r>
         <w:t>3. Requerimientos funcionales</w:t>
       </w:r>
@@ -2895,7 +2866,7 @@
       <w:pPr>
         <w:pStyle w:val="Heading2"/>
       </w:pPr>
-      <w:bookmarkStart w:id="7" w:name="_Toc242618221"/>
+      <w:bookmarkStart w:id="7" w:name="_Toc243836806"/>
       <w:r>
         <w:lastRenderedPageBreak/>
         <w:t>3.1 Gestión del festival</w:t>
@@ -3303,7 +3274,7 @@
       <w:pPr>
         <w:pStyle w:val="Heading2"/>
       </w:pPr>
-      <w:bookmarkStart w:id="8" w:name="_Toc242618222"/>
+      <w:bookmarkStart w:id="8" w:name="_Toc243836807"/>
       <w:r>
         <w:t>3.2 Gestión de películas</w:t>
       </w:r>
@@ -3772,7 +3743,7 @@
       <w:pPr>
         <w:pStyle w:val="Heading2"/>
       </w:pPr>
-      <w:bookmarkStart w:id="9" w:name="_Toc242618223"/>
+      <w:bookmarkStart w:id="9" w:name="_Toc243836808"/>
       <w:r>
         <w:t>3.3 Programación de funciones</w:t>
       </w:r>
@@ -4045,7 +4016,7 @@
                 <w:sz w:val="19"/>
                 <w:szCs w:val="19"/>
               </w:rPr>
-              <w:t xml:space="preserve">Consultar las funciones programadas. Cada función se identifica con un código (F-1, F-2...).</w:t>
+              <w:t>Consultar las funciones programadas. Cada función se identifica con un código (F-1, F-2...).</w:t>
             </w:r>
           </w:p>
         </w:tc>
@@ -4117,7 +4088,7 @@
       <w:pPr>
         <w:pStyle w:val="Heading2"/>
       </w:pPr>
-      <w:bookmarkStart w:id="10" w:name="_Toc242618224"/>
+      <w:bookmarkStart w:id="10" w:name="_Toc243836809"/>
       <w:r>
         <w:t>3.4 Venta de entradas</w:t>
       </w:r>
@@ -4328,7 +4299,7 @@
                 <w:sz w:val="19"/>
                 <w:szCs w:val="19"/>
               </w:rPr>
-              <w:t xml:space="preserve">Vender entradas para funciones presenciales que todavía no comenzaron, asignando una butaca disponible y mostrando antes las butacas ocupadas.</w:t>
+              <w:t>Vender entradas para funciones presenciales que todavía no comenzaron, asignando una butaca disponible y mostrando antes las butacas ocupadas.</w:t>
             </w:r>
           </w:p>
         </w:tc>
@@ -4390,7 +4361,7 @@
                 <w:sz w:val="19"/>
                 <w:szCs w:val="19"/>
               </w:rPr>
-              <w:t xml:space="preserve">Vender entradas para funciones streaming que todavía no comenzaron, generando un enlace de acceso para el espectador.</w:t>
+              <w:t>Vender entradas para funciones streaming que todavía no comenzaron, generando un enlace de acceso para el espectador.</w:t>
             </w:r>
           </w:p>
         </w:tc>
@@ -4586,7 +4557,7 @@
       <w:pPr>
         <w:pStyle w:val="Heading2"/>
       </w:pPr>
-      <w:bookmarkStart w:id="11" w:name="_Toc242618225"/>
+      <w:bookmarkStart w:id="11" w:name="_Toc243836810"/>
       <w:r>
         <w:lastRenderedPageBreak/>
         <w:t>3.5 Abonos del festival</w:t>
@@ -4994,7 +4965,7 @@
       <w:pPr>
         <w:pStyle w:val="Heading2"/>
       </w:pPr>
-      <w:bookmarkStart w:id="12" w:name="_Toc242618226"/>
+      <w:bookmarkStart w:id="12" w:name="_Toc243836811"/>
       <w:r>
         <w:t>3.6 Evaluación y premios</w:t>
       </w:r>
@@ -5463,7 +5434,7 @@
       <w:pPr>
         <w:pStyle w:val="Heading2"/>
       </w:pPr>
-      <w:bookmarkStart w:id="13" w:name="_Toc242618227"/>
+      <w:bookmarkStart w:id="13" w:name="_Toc243836812"/>
       <w:r>
         <w:t>3.7 Persistencia y operación general</w:t>
       </w:r>
@@ -5612,7 +5583,7 @@
                 <w:sz w:val="19"/>
                 <w:szCs w:val="19"/>
               </w:rPr>
-              <w:t xml:space="preserve">Cargar automáticamente todos los datos guardados al iniciar el sistema. Si una línea de un archivo tiene errores, se saltea y al terminar la carga se informan los errores con su archivo, línea y motivo (se muestran los primeros 15 y la cantidad restante). El sistema abre igual con el resto de los datos.</w:t>
+              <w:t>Cargar automáticamente todos los datos guardados al iniciar el sistema. Si una línea de un archivo tiene errores, se saltea y al terminar la carga se informan los errores con su archivo, línea y motivo (se muestran los primeros 15 y la cantidad restante). El sistema abre igual con el resto de los datos.</w:t>
             </w:r>
           </w:p>
         </w:tc>
@@ -5674,7 +5645,7 @@
                 <w:sz w:val="19"/>
                 <w:szCs w:val="19"/>
               </w:rPr>
-              <w:t xml:space="preserve">Guardar los datos desde el menú Archivo y al cerrar la aplicación, previa confirmación del usuario. Si al abrir hubo líneas que no se pudieron cargar, se avisa antes de guardar que esas líneas se van a perder. Si el guardado falla al cerrar, se informa el error y se puede elegir no salir.</w:t>
+              <w:t>Guardar los datos desde el menú Archivo y al cerrar la aplicación, previa confirmación del usuario. Si al abrir hubo líneas que no se pudieron cargar, se avisa antes de guardar que esas líneas se van a perder. Si el guardado falla al cerrar, se informa el error y se puede elegir no salir.</w:t>
             </w:r>
           </w:p>
         </w:tc>
@@ -5771,7 +5742,7 @@
                 <w:sz w:val="19"/>
                 <w:szCs w:val="19"/>
               </w:rPr>
-              <w:t xml:space="preserve">RF-36</w:t>
+              <w:t>RF-36</w:t>
             </w:r>
           </w:p>
         </w:tc>
@@ -5798,7 +5769,7 @@
                 <w:sz w:val="19"/>
                 <w:szCs w:val="19"/>
               </w:rPr>
-              <w:t xml:space="preserve">Cargar datos de ejemplo (ediciones, secciones, reparto, funciones, entradas, abonos y votos) la primera vez que se abre el sistema, cuando todavía no hay ediciones guardadas.</w:t>
+              <w:t>Cargar datos de ejemplo (ediciones, secciones, reparto, funciones, entradas, abonos y votos) la primera vez que se abre el sistema, cuando todavía no hay ediciones guardadas.</w:t>
             </w:r>
           </w:p>
         </w:tc>
@@ -5808,7 +5779,7 @@
       <w:pPr>
         <w:pStyle w:val="Heading1"/>
       </w:pPr>
-      <w:bookmarkStart w:id="14" w:name="_Toc242618228"/>
+      <w:bookmarkStart w:id="14" w:name="_Toc243836813"/>
       <w:r>
         <w:t>4. Reglas de negocio</w:t>
       </w:r>
@@ -5819,15 +5790,16 @@
         <w:spacing w:after="120"/>
       </w:pPr>
       <w:r>
-        <w:t xml:space="preserve">Las reglas se validan en el modelo: cada clase controla sus propias reglas y los constructores no permiten crear objetos con datos inválidos. Los servicios coordinan las operaciones y los formularios de la interfaz solo controlan el formato de lo ingresado. Si se intenta una operación que no las cumple, el sistema la rechaza con un mensaje que explica el motivo.</w:t>
+        <w:t>Las reglas se validan en el modelo: cada clase controla sus propias reglas y los constructores no permiten crear objetos con datos inválidos. Los servicios coordinan las operaciones y los formularios de la interfaz solo controlan el formato de lo ingresado. Si se intenta una operación que no las cumple, el sistema la rechaza con un mensaje que explica el motivo.</w:t>
       </w:r>
     </w:p>
     <w:p>
       <w:pPr>
         <w:pStyle w:val="Heading2"/>
       </w:pPr>
-      <w:bookmarkStart w:id="15" w:name="_Toc242618229"/>
+      <w:bookmarkStart w:id="15" w:name="_Toc243836814"/>
       <w:r>
+        <w:lastRenderedPageBreak/>
         <w:t>4.1 Festival y funciones</w:t>
       </w:r>
       <w:bookmarkEnd w:id="15"/>
@@ -6037,7 +6009,7 @@
                 <w:sz w:val="19"/>
                 <w:szCs w:val="19"/>
               </w:rPr>
-              <w:t xml:space="preserve">No se puede programar una función en una fecha u hora que ya pasó.</w:t>
+              <w:t>No se puede programar una función en una fecha u hora que ya pasó.</w:t>
             </w:r>
           </w:p>
         </w:tc>
@@ -6072,7 +6044,7 @@
                 <w:sz w:val="19"/>
                 <w:szCs w:val="19"/>
               </w:rPr>
-              <w:t xml:space="preserve">RN-03</w:t>
+              <w:t>RN-03</w:t>
             </w:r>
           </w:p>
         </w:tc>
@@ -6099,7 +6071,7 @@
                 <w:sz w:val="19"/>
                 <w:szCs w:val="19"/>
               </w:rPr>
-              <w:t xml:space="preserve">Una función solo se puede programar para una película que compite en una edición, y su fecha debe estar entre la fecha de inicio y la de fin de esa edición.</w:t>
+              <w:t>Una función solo se puede programar para una película que compite en una edición, y su fecha debe estar entre la fecha de inicio y la de fin de esa edición.</w:t>
             </w:r>
           </w:p>
         </w:tc>
@@ -6161,7 +6133,7 @@
                 <w:sz w:val="19"/>
                 <w:szCs w:val="19"/>
               </w:rPr>
-              <w:t xml:space="preserve">Dos funciones presenciales en la misma sala no pueden superponerse en horario: cada función ocupa la sala desde su inicio hasta que termina la película (inicio + duración).</w:t>
+              <w:t>Dos funciones presenciales en la misma sala no pueden superponerse en horario: cada función ocupa la sala desde su inicio hasta que termina la película (inicio + duración).</w:t>
             </w:r>
           </w:p>
         </w:tc>
@@ -6320,7 +6292,6 @@
                 <w:sz w:val="19"/>
                 <w:szCs w:val="19"/>
               </w:rPr>
-              <w:lastRenderedPageBreak/>
               <w:t>RN-07</w:t>
             </w:r>
           </w:p>
@@ -6383,7 +6354,7 @@
                 <w:sz w:val="19"/>
                 <w:szCs w:val="19"/>
               </w:rPr>
-              <w:t xml:space="preserve">RN-08</w:t>
+              <w:t>RN-08</w:t>
             </w:r>
           </w:p>
         </w:tc>
@@ -6410,7 +6381,7 @@
                 <w:sz w:val="19"/>
                 <w:szCs w:val="19"/>
               </w:rPr>
-              <w:t xml:space="preserve">No se pueden vender entradas de una función que ya comenzó (se compara la fecha y la hora).</w:t>
+              <w:t>No se pueden vender entradas de una función que ya comenzó (se compara la fecha y la hora).</w:t>
             </w:r>
           </w:p>
         </w:tc>
@@ -6569,7 +6540,7 @@
                 <w:sz w:val="19"/>
                 <w:szCs w:val="19"/>
               </w:rPr>
-              <w:t xml:space="preserve">RN-11</w:t>
+              <w:t>RN-11</w:t>
             </w:r>
           </w:p>
         </w:tc>
@@ -6596,7 +6567,7 @@
                 <w:sz w:val="19"/>
                 <w:szCs w:val="19"/>
               </w:rPr>
-              <w:t xml:space="preserve">No se puede quitar una película de una sección si tiene funciones programadas y es su única sección en la edición.</w:t>
+              <w:t>No se puede quitar una película de una sección si tiene funciones programadas y es su única sección en la edición.</w:t>
             </w:r>
           </w:p>
         </w:tc>
@@ -6668,7 +6639,7 @@
       <w:pPr>
         <w:pStyle w:val="Heading2"/>
       </w:pPr>
-      <w:bookmarkStart w:id="16" w:name="_Toc242618230"/>
+      <w:bookmarkStart w:id="16" w:name="_Toc243836815"/>
       <w:r>
         <w:t>4.2 Precios y tarifas</w:t>
       </w:r>
@@ -6951,7 +6922,7 @@
       <w:pPr>
         <w:pStyle w:val="Heading2"/>
       </w:pPr>
-      <w:bookmarkStart w:id="17" w:name="_Toc242618231"/>
+      <w:bookmarkStart w:id="17" w:name="_Toc243836816"/>
       <w:r>
         <w:t>4.3 Abonos y reservas</w:t>
       </w:r>
@@ -7224,7 +7195,7 @@
                 <w:sz w:val="19"/>
                 <w:szCs w:val="19"/>
               </w:rPr>
-              <w:t xml:space="preserve">Solo se puede reservar una función que el abono cubra y que todavía no haya comenzado.</w:t>
+              <w:t>Solo se puede reservar una función que el abono cubra y que todavía no haya comenzado.</w:t>
             </w:r>
           </w:p>
         </w:tc>
@@ -7286,7 +7257,7 @@
                 <w:sz w:val="19"/>
                 <w:szCs w:val="19"/>
               </w:rPr>
-              <w:t xml:space="preserve">Un abono no puede tener dos reservas que se superpongan en horario, según la duración de cada película.</w:t>
+              <w:t>Un abono no puede tener dos reservas que se superpongan en horario, según la duración de cada película.</w:t>
             </w:r>
           </w:p>
         </w:tc>
@@ -7383,6 +7354,7 @@
                 <w:sz w:val="19"/>
                 <w:szCs w:val="19"/>
               </w:rPr>
+              <w:lastRenderedPageBreak/>
               <w:t>RN-21</w:t>
             </w:r>
           </w:p>
@@ -7410,7 +7382,7 @@
                 <w:sz w:val="19"/>
                 <w:szCs w:val="19"/>
               </w:rPr>
-              <w:t xml:space="preserve">Solo se pueden cancelar reservas hechas con abono, y siempre que la función no haya comenzado. Las entradas sueltas no se cancelan.</w:t>
+              <w:t>Solo se pueden cancelar reservas hechas con abono, y siempre que la función no haya comenzado. Las entradas sueltas no se cancelan.</w:t>
             </w:r>
           </w:p>
         </w:tc>
@@ -7420,7 +7392,7 @@
       <w:pPr>
         <w:pStyle w:val="Heading2"/>
       </w:pPr>
-      <w:bookmarkStart w:id="18" w:name="_Toc242618232"/>
+      <w:bookmarkStart w:id="18" w:name="_Toc243836817"/>
       <w:r>
         <w:t>4.4 Evaluaciones y votos</w:t>
       </w:r>
@@ -7604,7 +7576,7 @@
                 <w:sz w:val="19"/>
                 <w:szCs w:val="19"/>
               </w:rPr>
-              <w:t xml:space="preserve">RN-23</w:t>
+              <w:t>RN-23</w:t>
             </w:r>
           </w:p>
         </w:tc>
@@ -7631,7 +7603,7 @@
                 <w:sz w:val="19"/>
                 <w:szCs w:val="19"/>
               </w:rPr>
-              <w:t xml:space="preserve">Un jurado puede evaluar cada película una sola vez.</w:t>
+              <w:t>Un jurado puede evaluar cada película una sola vez.</w:t>
             </w:r>
           </w:p>
         </w:tc>
@@ -7693,7 +7665,7 @@
                 <w:sz w:val="19"/>
                 <w:szCs w:val="19"/>
               </w:rPr>
-              <w:t xml:space="preserve">La ganadora de una sección es la película con mayor puntaje promedio del jurado, entre las que tienen al menos una evaluación. Si hay empate, gana la que tiene más evaluaciones. Si ninguna fue evaluada, la sección no tiene ganadora.</w:t>
+              <w:t>La ganadora de una sección es la película con mayor puntaje promedio del jurado, entre las que tienen al menos una evaluación. Si hay empate, gana la que tiene más evaluaciones. Si ninguna fue evaluada, la sección no tiene ganadora.</w:t>
             </w:r>
           </w:p>
         </w:tc>
@@ -7941,7 +7913,7 @@
                 <w:sz w:val="19"/>
                 <w:szCs w:val="19"/>
               </w:rPr>
-              <w:t xml:space="preserve">El Premio del Público de una edición es para la película de sus secciones con mejor promedio de votos del público; si hay empate, gana la que tiene más votos, y si no hay votos no se otorga. Es independiente del premio del jurado.</w:t>
+              <w:t>El Premio del Público de una edición es para la película de sus secciones con mejor promedio de votos del público; si hay empate, gana la que tiene más votos, y si no hay votos no se otorga. Es independiente del premio del jurado.</w:t>
             </w:r>
           </w:p>
         </w:tc>
@@ -7951,9 +7923,8 @@
       <w:pPr>
         <w:pStyle w:val="Heading2"/>
       </w:pPr>
-      <w:bookmarkStart w:id="19" w:name="_Toc242618233"/>
+      <w:bookmarkStart w:id="19" w:name="_Toc243836818"/>
       <w:r>
-        <w:lastRenderedPageBreak/>
         <w:t>4.5 Validaciones de datos de entrada</w:t>
       </w:r>
       <w:bookmarkEnd w:id="19"/>
@@ -8163,7 +8134,7 @@
                 <w:sz w:val="19"/>
                 <w:szCs w:val="19"/>
               </w:rPr>
-              <w:t xml:space="preserve">Los valores numéricos deben ser enteros válidos (el puntaje del jurado admite decimales). La duración de una película y la capacidad de una sala deben ser mayores a 0, y la capacidad virtual de una función streaming debe estar entre 1 y 1000. Estas validaciones las hace el modelo, por lo que también se aplican a los datos que se cargan desde los archivos.</w:t>
+              <w:t>Los valores numéricos deben ser enteros válidos (el puntaje del jurado admite decimales). La duración de una película y la capacidad de una sala deben ser mayores a 0, y la capacidad virtual de una función streaming debe estar entre 1 y 1000. Estas validaciones las hace el modelo, por lo que también se aplican a los datos que se cargan desde los archivos.</w:t>
             </w:r>
           </w:p>
         </w:tc>
@@ -8287,17 +8258,8 @@
                 <w:sz w:val="19"/>
                 <w:szCs w:val="19"/>
               </w:rPr>
-              <w:t xml:space="preserve">Las fechas se ingresan con el formato AAAA-MM-DD y los horarios con el formato </w:t>
-            </w:r>
-            <w:proofErr w:type="gramStart"/>
-            <w:r>
-              <w:rPr>
-                <w:sz w:val="19"/>
-                <w:szCs w:val="19"/>
-              </w:rPr>
-              <w:t>HH:MM.</w:t>
-            </w:r>
-            <w:proofErr w:type="gramEnd"/>
+              <w:t>Las fechas se ingresan con el formato AAAA-MM-DD y los horarios con el formato HH:MM.</w:t>
+            </w:r>
           </w:p>
         </w:tc>
       </w:tr>
@@ -8331,7 +8293,7 @@
                 <w:sz w:val="19"/>
                 <w:szCs w:val="19"/>
               </w:rPr>
-              <w:t xml:space="preserve">RN-33</w:t>
+              <w:t>RN-33</w:t>
             </w:r>
           </w:p>
         </w:tc>
@@ -8358,7 +8320,7 @@
                 <w:sz w:val="19"/>
                 <w:szCs w:val="19"/>
               </w:rPr>
-              <w:t xml:space="preserve">No puede haber dos personas del mismo rol (director, actor, jurado o espectador) con el mismo email, que es lo que identifica a cada persona, ni dos películas con el mismo título. Un actor no se puede asociar dos veces a la misma película.</w:t>
+              <w:t>No puede haber dos personas del mismo rol (director, actor, jurado o espectador) con el mismo email, que es lo que identifica a cada persona, ni dos películas con el mismo título. Un actor no se puede asociar dos veces a la misma película.</w:t>
             </w:r>
           </w:p>
         </w:tc>
@@ -8368,7 +8330,7 @@
       <w:pPr>
         <w:pStyle w:val="Heading1"/>
       </w:pPr>
-      <w:bookmarkStart w:id="20" w:name="_Toc242618234"/>
+      <w:bookmarkStart w:id="20" w:name="_Toc243836819"/>
       <w:r>
         <w:t>5. Requerimientos no funcionales</w:t>
       </w:r>
@@ -8699,6 +8661,7 @@
                 <w:sz w:val="19"/>
                 <w:szCs w:val="19"/>
               </w:rPr>
+              <w:lastRenderedPageBreak/>
               <w:t>RNF-03</w:t>
             </w:r>
           </w:p>
@@ -8753,7 +8716,7 @@
                 <w:sz w:val="19"/>
                 <w:szCs w:val="19"/>
               </w:rPr>
-              <w:t xml:space="preserve">El código se organiza en los paquetes modelo, servicios, persistencia, excepciones, ui (con ui/comun para las piezas compartidas de la interfaz) y app. Las reglas de negocio están en el modelo; siete servicios (personas, películas, festival, funciones, ventas, abonos y evaluaciones) coordinan los casos de uso; la interfaz solo muestra los datos y valida el formato de lo ingresado.</w:t>
+              <w:t>El código se organiza en los paquetes modelo, servicios, persistencia, excepciones, ui (con ui/comun para las piezas compartidas de la interfaz) y app. Las reglas de negocio están en el modelo; siete servicios (personas, películas, festival, funciones, ventas, abonos y evaluaciones) coordinan los casos de uso; la interfaz solo muestra los datos y valida el formato de lo ingresado.</w:t>
             </w:r>
           </w:p>
         </w:tc>
@@ -8842,7 +8805,7 @@
                 <w:sz w:val="19"/>
                 <w:szCs w:val="19"/>
               </w:rPr>
-              <w:t xml:space="preserve">Los datos se guardan en 15 archivos de texto en la carpeta datos/ (UTF-8, campos separados por ";"): salas, directores, actores, jurados, espectadores, películas, reparto, ediciones, secciones, películas por sección, funciones, evaluaciones, abonos, entradas y votos. Las relaciones se guardan por clave (email, título o código). Cada archivo se escribe primero en un archivo temporal y después reemplaza al anterior, así un error no deja un archivo a medias.</w:t>
+              <w:t>Los datos se guardan en 15 archivos de texto en la carpeta datos/ (UTF-8, campos separados por ";"): salas, directores, actores, jurados, espectadores, películas, reparto, ediciones, secciones, películas por sección, funciones, evaluaciones, abonos, entradas y votos. Las relaciones se guardan por clave (email, título o código). Cada archivo se escribe primero en un archivo temporal y después reemplaza al anterior, así un error no deja un archivo a medias.</w:t>
             </w:r>
           </w:p>
         </w:tc>
@@ -8931,7 +8894,7 @@
                 <w:sz w:val="19"/>
                 <w:szCs w:val="19"/>
               </w:rPr>
-              <w:t xml:space="preserve">Los errores se manejan con excepciones propias. Las de negocio son unchecked y heredan de FestivalException (abstracta), con cuatro ramas: DatoInvalidoException, EntidadDuplicadaException, EntidadNoEncontradaException y ReglaNegocioException (de la que heredan las de abonos, butacas, capacidad, funciones y votos). Los errores de archivos (PersistenciaException) y de formato en los formularios (CampoInvalidoException) son checked. El sistema informa el error sin cerrarse.</w:t>
+              <w:t>Los errores se manejan con excepciones propias. Las de negocio son unchecked y heredan de FestivalException (abstracta), con cuatro ramas: DatoInvalidoException, EntidadDuplicadaException, EntidadNoEncontradaException y ReglaNegocioException (de la que heredan las de abonos, butacas, capacidad, funciones y votos). Los errores de archivos (PersistenciaException) y de formato en los formularios (CampoInvalidoException) son checked. El sistema informa el error sin cerrarse.</w:t>
             </w:r>
           </w:p>
         </w:tc>
@@ -9020,23 +8983,7 @@
                 <w:sz w:val="19"/>
                 <w:szCs w:val="19"/>
               </w:rPr>
-              <w:t>Barra de estado informativa, confirmación antes de operaciones críticas, búsqueda y filtro sobre tablas, e indicador gráfico de ocupación (</w:t>
-            </w:r>
-            <w:proofErr w:type="spellStart"/>
-            <w:r>
-              <w:rPr>
-                <w:sz w:val="19"/>
-                <w:szCs w:val="19"/>
-              </w:rPr>
-              <w:t>JProgressBar</w:t>
-            </w:r>
-            <w:proofErr w:type="spellEnd"/>
-            <w:r>
-              <w:rPr>
-                <w:sz w:val="19"/>
-                <w:szCs w:val="19"/>
-              </w:rPr>
-              <w:t>).</w:t>
+              <w:t>Barra de estado informativa, confirmación antes de operaciones críticas, búsqueda y filtro sobre tablas, e indicador gráfico de ocupación (JProgressBar).</w:t>
             </w:r>
           </w:p>
         </w:tc>
@@ -9125,7 +9072,7 @@
                 <w:sz w:val="19"/>
                 <w:szCs w:val="19"/>
               </w:rPr>
-              <w:t xml:space="preserve">El guardado desde el menú se ejecuta en un hilo secundario para que la interfaz no se congele: el texto de los archivos se arma en el hilo de la interfaz y el hilo secundario solo lo escribe. Mientras guarda, la opción Guardar datos queda deshabilitada, y al cerrar el sistema espera a que termine.</w:t>
+              <w:t>El guardado desde el menú se ejecuta en un hilo secundario para que la interfaz no se congele: el texto de los archivos se arma en el hilo de la interfaz y el hilo secundario solo lo escribe. Mientras guarda, la opción Guardar datos queda deshabilitada, y al cerrar el sistema espera a que termine.</w:t>
             </w:r>
           </w:p>
         </w:tc>
@@ -9214,7 +9161,7 @@
                 <w:sz w:val="19"/>
                 <w:szCs w:val="19"/>
               </w:rPr>
-              <w:t xml:space="preserve">El modelo aplica herencia, polimorfismo, encapsulamiento y colecciones, y busca bajo acoplamiento y alta cohesión. En esta entrega no se aplican patrones de diseño; se incorporan en la tercera entrega.</w:t>
+              <w:t>El modelo aplica herencia, polimorfismo, encapsulamiento y colecciones, y busca bajo acoplamiento y alta cohesión. En esta entrega no se aplican patrones de diseño; se incorporan en la tercera entrega.</w:t>
             </w:r>
           </w:p>
         </w:tc>
@@ -9225,7 +9172,7 @@
         <w:pStyle w:val="Heading1"/>
         <w:pageBreakBefore/>
       </w:pPr>
-      <w:bookmarkStart w:id="21" w:name="_Toc242618235"/>
+      <w:bookmarkStart w:id="21" w:name="_Toc243836820"/>
       <w:r>
         <w:lastRenderedPageBreak/>
         <w:t>6. Funcionalidades agregadas en este proyecto</w:t>
@@ -9237,7 +9184,7 @@
         <w:spacing w:after="120"/>
       </w:pPr>
       <w:r>
-        <w:t xml:space="preserve">Sobre el sistema existente, en este proyecto se incorporaron las siguientes funcionalidades (los nombres de las clases corresponden al código de la segunda entrega; ver la sección 7):</w:t>
+        <w:t>Sobre el sistema existente, en este proyecto se incorporaron las siguientes funcionalidades (los nombres de las clases corresponden al código de la segunda entrega; ver la sección 7):</w:t>
       </w:r>
     </w:p>
     <w:tbl>
@@ -9440,7 +9387,7 @@
                 <w:sz w:val="19"/>
                 <w:szCs w:val="19"/>
               </w:rPr>
-              <w:t xml:space="preserve">Nuevas: TipoTarifa, TipoAbono, Abono (abstracta), AbonoTresDias, AbonoFull, AbonoStreaming, AbonoInvalidoException, AbonoServicio, PanelAbonos, DialogoComprarAbono, DialogoReservaAbono.</w:t>
+              <w:t>Nuevas: TipoTarifa, TipoAbono, Abono (abstracta), AbonoTresDias, AbonoFull, AbonoStreaming, AbonoInvalidoException, AbonoServicio, PanelAbonos, DialogoComprarAbono, DialogoReservaAbono.</w:t>
             </w:r>
           </w:p>
           <w:p>
@@ -9454,7 +9401,7 @@
                 <w:sz w:val="19"/>
                 <w:szCs w:val="19"/>
               </w:rPr>
-              <w:t xml:space="preserve">Modificadas: Entrada, EntradaPresencial, EntradaStreaming, Espectador, FuncionPresencial, FuncionStreaming, VentaServicio, PanelVentaEntradas.</w:t>
+              <w:t>Modificadas: Entrada, EntradaPresencial, EntradaStreaming, Espectador, FuncionPresencial, FuncionStreaming, VentaServicio, PanelVentaEntradas.</w:t>
             </w:r>
           </w:p>
         </w:tc>
@@ -9542,7 +9489,7 @@
                 <w:sz w:val="19"/>
                 <w:szCs w:val="19"/>
               </w:rPr>
-              <w:t xml:space="preserve">Nuevas: VotoPublico, VotoInvalidoException, EvaluacionServicio, PanelVotoPublico.</w:t>
+              <w:t>Nuevas: VotoPublico, VotoInvalidoException, EvaluacionServicio, PanelVotoPublico.</w:t>
             </w:r>
           </w:p>
           <w:p>
@@ -9556,7 +9503,7 @@
                 <w:sz w:val="19"/>
                 <w:szCs w:val="19"/>
               </w:rPr>
-              <w:t xml:space="preserve">Modificadas: Pelicula, Edicion, Espectador.</w:t>
+              <w:t>Modificadas: Pelicula, Edicion, Espectador.</w:t>
             </w:r>
           </w:p>
         </w:tc>
@@ -9572,20 +9519,7 @@
         <w:spacing w:after="120"/>
       </w:pPr>
       <w:r>
-        <w:t xml:space="preserve">Los tipos de abono aplican polimorfismo: cada subclase de Abono redefine </w:t>
-      </w:r>
-      <w:proofErr w:type="gramStart"/>
-      <w:r>
-        <w:t>cubre(</w:t>
-      </w:r>
-      <w:proofErr w:type="spellStart"/>
-      <w:proofErr w:type="gramEnd"/>
-      <w:r>
-        <w:t>Funcion</w:t>
-      </w:r>
-      <w:proofErr w:type="spellEnd"/>
-      <w:r>
-        <w:t>) para indicar qué funciones permite reservar.</w:t>
+        <w:t>Los tipos de abono aplican polimorfismo: cada subclase de Abono redefine cubre(Funcion) para indicar qué funciones permite reservar.</w:t>
       </w:r>
     </w:p>
     <w:p>
@@ -9593,18 +9527,19 @@
         <w:pStyle w:val="Heading1"/>
         <w:pageBreakBefore/>
       </w:pPr>
-      <w:bookmarkStart w:id="123" w:name="_TocSegundaEntrega"/>
+      <w:bookmarkStart w:id="22" w:name="_Toc243836821"/>
       <w:r>
-        <w:t xml:space="preserve">7. Cambios de la segunda entrega</w:t>
+        <w:lastRenderedPageBreak/>
+        <w:t>7. Cambios de la segunda entrega</w:t>
       </w:r>
-      <w:bookmarkEnd w:id="123"/>
+      <w:bookmarkEnd w:id="22"/>
     </w:p>
     <w:p>
       <w:pPr>
         <w:spacing w:after="120"/>
       </w:pPr>
       <w:r>
-        <w:t xml:space="preserve">En la segunda entrega se corrigieron problemas de integridad, de persistencia y de calidad del código detectados en la primera versión. Las correcciones se hicieron sin patrones de diseño: solo con herencia, clases abstractas, polimorfismo, enums, excepciones propias y colecciones. Los patrones se incorporan en la tercera entrega.</w:t>
+        <w:t>En la segunda entrega se corrigieron problemas de integridad, de persistencia y de calidad del código detectados en la primera versión. Las correcciones se hicieron sin patrones de diseño: solo con herencia, clases abstractas, polimorfismo, enums, excepciones propias y colecciones. Los patrones se incorporan en la tercera entrega.</w:t>
       </w:r>
     </w:p>
     <w:p>
@@ -9612,18 +9547,18 @@
         <w:spacing w:after="120"/>
       </w:pPr>
       <w:r>
-        <w:t xml:space="preserve">Cada cambio está marcado en el código con un comentario CORRECCIÓN seguido de su código (por ejemplo, CORRECCIÓN I3), y el detalle completo está en el archivo CORRECCIONES.txt de la raíz del proyecto. Entre paréntesis se indica la regla o requerimiento de este documento relacionado.</w:t>
+        <w:t>Cada cambio está marcado en el código con un comentario CORRECCIÓN seguido de su código (por ejemplo, CORRECCIÓN I3), y el detalle completo está en el archivo CORRECCIONES.txt de la raíz del proyecto. Entre paréntesis se indica la regla o requerimiento de este documento relacionado.</w:t>
       </w:r>
     </w:p>
     <w:p>
       <w:pPr>
         <w:pStyle w:val="Heading2"/>
       </w:pPr>
-      <w:bookmarkStart w:id="124" w:name="_TocSegundaEntrega1"/>
+      <w:bookmarkStart w:id="23" w:name="_Toc243836822"/>
       <w:r>
-        <w:t xml:space="preserve">7.1 Integridad y reglas de negocio</w:t>
+        <w:t>7.1 Integridad y reglas de negocio</w:t>
       </w:r>
-      <w:bookmarkEnd w:id="124"/>
+      <w:bookmarkEnd w:id="23"/>
     </w:p>
     <w:tbl>
       <w:tblPr>
@@ -9676,7 +9611,7 @@
                 <w:sz w:val="19"/>
                 <w:szCs w:val="19"/>
               </w:rPr>
-              <w:t xml:space="preserve">Código</w:t>
+              <w:t>Código</w:t>
             </w:r>
           </w:p>
         </w:tc>
@@ -9706,7 +9641,7 @@
                 <w:sz w:val="19"/>
                 <w:szCs w:val="19"/>
               </w:rPr>
-              <w:t xml:space="preserve">Corrección</w:t>
+              <w:t>Corrección</w:t>
             </w:r>
           </w:p>
         </w:tc>
@@ -9741,7 +9676,7 @@
                 <w:sz w:val="19"/>
                 <w:szCs w:val="19"/>
               </w:rPr>
-              <w:t xml:space="preserve">I1</w:t>
+              <w:t>I1</w:t>
             </w:r>
           </w:p>
         </w:tc>
@@ -9768,7 +9703,7 @@
                 <w:sz w:val="19"/>
                 <w:szCs w:val="19"/>
               </w:rPr>
-              <w:t xml:space="preserve">Ya no se venden entradas de funciones que comenzaron: se compara la fecha y la hora (RN-08).</w:t>
+              <w:t>Ya no se venden entradas de funciones que comenzaron: se compara la fecha y la hora (RN-08).</w:t>
             </w:r>
           </w:p>
         </w:tc>
@@ -9803,7 +9738,7 @@
                 <w:sz w:val="19"/>
                 <w:szCs w:val="19"/>
               </w:rPr>
-              <w:t xml:space="preserve">I2</w:t>
+              <w:t>I2</w:t>
             </w:r>
           </w:p>
         </w:tc>
@@ -9830,7 +9765,7 @@
                 <w:sz w:val="19"/>
                 <w:szCs w:val="19"/>
               </w:rPr>
-              <w:t xml:space="preserve">Reservar y cancelar con abono también comparan la fecha y la hora (RN-18, RN-21).</w:t>
+              <w:t>Reservar y cancelar con abono también comparan la fecha y la hora (RN-18, RN-21).</w:t>
             </w:r>
           </w:p>
         </w:tc>
@@ -9865,7 +9800,7 @@
                 <w:sz w:val="19"/>
                 <w:szCs w:val="19"/>
               </w:rPr>
-              <w:t xml:space="preserve">I3</w:t>
+              <w:t>I3</w:t>
             </w:r>
           </w:p>
         </w:tc>
@@ -9892,7 +9827,7 @@
                 <w:sz w:val="19"/>
                 <w:szCs w:val="19"/>
               </w:rPr>
-              <w:t xml:space="preserve">Un jurado evalúa cada película una sola vez (RN-23).</w:t>
+              <w:t>Un jurado evalúa cada película una sola vez (RN-23).</w:t>
             </w:r>
           </w:p>
         </w:tc>
@@ -9927,7 +9862,7 @@
                 <w:sz w:val="19"/>
                 <w:szCs w:val="19"/>
               </w:rPr>
-              <w:t xml:space="preserve">I4</w:t>
+              <w:t>I4</w:t>
             </w:r>
           </w:p>
         </w:tc>
@@ -9954,7 +9889,7 @@
                 <w:sz w:val="19"/>
                 <w:szCs w:val="19"/>
               </w:rPr>
-              <w:t xml:space="preserve">Las funciones de una misma sala no se superponen, según la duración de la película (RN-04).</w:t>
+              <w:t>Las funciones de una misma sala no se superponen, según la duración de la película (RN-04).</w:t>
             </w:r>
           </w:p>
         </w:tc>
@@ -9989,7 +9924,7 @@
                 <w:sz w:val="19"/>
                 <w:szCs w:val="19"/>
               </w:rPr>
-              <w:t xml:space="preserve">I5</w:t>
+              <w:t>I5</w:t>
             </w:r>
           </w:p>
         </w:tc>
@@ -10016,7 +9951,7 @@
                 <w:sz w:val="19"/>
                 <w:szCs w:val="19"/>
               </w:rPr>
-              <w:t xml:space="preserve">Un abono no puede reservar funciones que se superponen (RN-19).</w:t>
+              <w:t>Un abono no puede reservar funciones que se superponen (RN-19).</w:t>
             </w:r>
           </w:p>
         </w:tc>
@@ -10051,7 +9986,7 @@
                 <w:sz w:val="19"/>
                 <w:szCs w:val="19"/>
               </w:rPr>
-              <w:t xml:space="preserve">I6</w:t>
+              <w:t>I6</w:t>
             </w:r>
           </w:p>
         </w:tc>
@@ -10078,7 +10013,7 @@
                 <w:sz w:val="19"/>
                 <w:szCs w:val="19"/>
               </w:rPr>
-              <w:t xml:space="preserve">Las funciones se programan solo para películas que compiten en una edición y dentro de sus fechas (RN-03).</w:t>
+              <w:t>Las funciones se programan solo para películas que compiten en una edición y dentro de sus fechas (RN-03).</w:t>
             </w:r>
           </w:p>
         </w:tc>
@@ -10113,7 +10048,7 @@
                 <w:sz w:val="19"/>
                 <w:szCs w:val="19"/>
               </w:rPr>
-              <w:t xml:space="preserve">I7</w:t>
+              <w:t>I7</w:t>
             </w:r>
           </w:p>
         </w:tc>
@@ -10140,7 +10075,7 @@
                 <w:sz w:val="19"/>
                 <w:szCs w:val="19"/>
               </w:rPr>
-              <w:t xml:space="preserve">No se puede quitar de su única sección una película con funciones programadas (RN-11).</w:t>
+              <w:t>No se puede quitar de su única sección una película con funciones programadas (RN-11).</w:t>
             </w:r>
           </w:p>
         </w:tc>
@@ -10175,7 +10110,7 @@
                 <w:sz w:val="19"/>
                 <w:szCs w:val="19"/>
               </w:rPr>
-              <w:t xml:space="preserve">I8</w:t>
+              <w:t>I8</w:t>
             </w:r>
           </w:p>
         </w:tc>
@@ -10202,7 +10137,7 @@
                 <w:sz w:val="19"/>
                 <w:szCs w:val="19"/>
               </w:rPr>
-              <w:t xml:space="preserve">Se controlan los duplicados de email, título, actor en el reparto y sala (RN-31, RN-33).</w:t>
+              <w:t>Se controlan los duplicados de email, título, actor en el reparto y sala (RN-31, RN-33).</w:t>
             </w:r>
           </w:p>
         </w:tc>
@@ -10237,7 +10172,7 @@
                 <w:sz w:val="19"/>
                 <w:szCs w:val="19"/>
               </w:rPr>
-              <w:t xml:space="preserve">I9</w:t>
+              <w:t>I9</w:t>
             </w:r>
           </w:p>
         </w:tc>
@@ -10264,7 +10199,7 @@
                 <w:sz w:val="19"/>
                 <w:szCs w:val="19"/>
               </w:rPr>
-              <w:t xml:space="preserve">Los constructores del modelo validan sus datos; antes varias validaciones estaban solo en la interfaz (RN-30).</w:t>
+              <w:t>Los constructores del modelo validan sus datos; antes varias validaciones estaban solo en la interfaz (RN-30).</w:t>
             </w:r>
           </w:p>
         </w:tc>
@@ -10299,7 +10234,7 @@
                 <w:sz w:val="19"/>
                 <w:szCs w:val="19"/>
               </w:rPr>
-              <w:t xml:space="preserve">I10</w:t>
+              <w:t>I10</w:t>
             </w:r>
           </w:p>
         </w:tc>
@@ -10326,7 +10261,7 @@
                 <w:sz w:val="19"/>
                 <w:szCs w:val="19"/>
               </w:rPr>
-              <w:t xml:space="preserve">Las personas se identifican por email y los combos de la interfaz guardan los objetos elegidos, así no se confunden homónimos.</w:t>
+              <w:t>Las personas se identifican por email y los combos de la interfaz guardan los objetos elegidos, así no se confunden homónimos.</w:t>
             </w:r>
           </w:p>
         </w:tc>
@@ -10361,7 +10296,7 @@
                 <w:sz w:val="19"/>
                 <w:szCs w:val="19"/>
               </w:rPr>
-              <w:t xml:space="preserve">I11</w:t>
+              <w:t>I11</w:t>
             </w:r>
           </w:p>
         </w:tc>
@@ -10388,7 +10323,7 @@
                 <w:sz w:val="19"/>
                 <w:szCs w:val="19"/>
               </w:rPr>
-              <w:t xml:space="preserve">Las funciones tienen un código propio (F-1, F-2...) (RF-14).</w:t>
+              <w:t>Las funciones tienen un código propio (F-1, F-2...) (RF-14).</w:t>
             </w:r>
           </w:p>
         </w:tc>
@@ -10423,7 +10358,7 @@
                 <w:sz w:val="19"/>
                 <w:szCs w:val="19"/>
               </w:rPr>
-              <w:t xml:space="preserve">I12</w:t>
+              <w:t>I12</w:t>
             </w:r>
           </w:p>
         </w:tc>
@@ -10450,7 +10385,7 @@
                 <w:sz w:val="19"/>
                 <w:szCs w:val="19"/>
               </w:rPr>
-              <w:t xml:space="preserve">No hay ganadora sin evaluaciones o votos, y hay un criterio de desempate (RN-24, RN-28).</w:t>
+              <w:t>No hay ganadora sin evaluaciones o votos, y hay un criterio de desempate (RN-24, RN-28).</w:t>
             </w:r>
           </w:p>
         </w:tc>
@@ -10485,7 +10420,7 @@
                 <w:sz w:val="19"/>
                 <w:szCs w:val="19"/>
               </w:rPr>
-              <w:t xml:space="preserve">I13</w:t>
+              <w:t>I13</w:t>
             </w:r>
           </w:p>
         </w:tc>
@@ -10512,7 +10447,7 @@
                 <w:sz w:val="19"/>
                 <w:szCs w:val="19"/>
               </w:rPr>
-              <w:t xml:space="preserve">Las listas internas del modelo no se pueden modificar desde afuera.</w:t>
+              <w:t>Las listas internas del modelo no se pueden modificar desde afuera.</w:t>
             </w:r>
           </w:p>
         </w:tc>
@@ -10547,7 +10482,7 @@
                 <w:sz w:val="19"/>
                 <w:szCs w:val="19"/>
               </w:rPr>
-              <w:t xml:space="preserve">I14</w:t>
+              <w:t>I14</w:t>
             </w:r>
           </w:p>
         </w:tc>
@@ -10574,7 +10509,7 @@
                 <w:sz w:val="19"/>
                 <w:szCs w:val="19"/>
               </w:rPr>
-              <w:t xml:space="preserve">Cada relación de dos lados (película y director, película y actor, entrada, espectador y abono) se actualiza en un solo método del modelo.</w:t>
+              <w:t>Cada relación de dos lados (película y director, película y actor, entrada, espectador y abono) se actualiza en un solo método del modelo.</w:t>
             </w:r>
           </w:p>
         </w:tc>
@@ -10584,11 +10519,11 @@
       <w:pPr>
         <w:pStyle w:val="Heading2"/>
       </w:pPr>
-      <w:bookmarkStart w:id="125" w:name="_TocSegundaEntrega2"/>
+      <w:bookmarkStart w:id="24" w:name="_Toc243836823"/>
       <w:r>
-        <w:t xml:space="preserve">7.2 Persistencia</w:t>
+        <w:t>7.2 Persistencia</w:t>
       </w:r>
-      <w:bookmarkEnd w:id="125"/>
+      <w:bookmarkEnd w:id="24"/>
     </w:p>
     <w:tbl>
       <w:tblPr>
@@ -10641,7 +10576,7 @@
                 <w:sz w:val="19"/>
                 <w:szCs w:val="19"/>
               </w:rPr>
-              <w:t xml:space="preserve">Código</w:t>
+              <w:t>Código</w:t>
             </w:r>
           </w:p>
         </w:tc>
@@ -10671,7 +10606,7 @@
                 <w:sz w:val="19"/>
                 <w:szCs w:val="19"/>
               </w:rPr>
-              <w:t xml:space="preserve">Corrección</w:t>
+              <w:t>Corrección</w:t>
             </w:r>
           </w:p>
         </w:tc>
@@ -10706,7 +10641,7 @@
                 <w:sz w:val="19"/>
                 <w:szCs w:val="19"/>
               </w:rPr>
-              <w:t xml:space="preserve">P1</w:t>
+              <w:t>P1</w:t>
             </w:r>
           </w:p>
         </w:tc>
@@ -10733,7 +10668,7 @@
                 <w:sz w:val="19"/>
                 <w:szCs w:val="19"/>
               </w:rPr>
-              <w:t xml:space="preserve">Los datos de ejemplo se cargan solo la primera vez; si fallan, el sistema abre igual (RF-36).</w:t>
+              <w:t>Los datos de ejemplo se cargan solo la primera vez; si fallan, el sistema abre igual (RF-36).</w:t>
             </w:r>
           </w:p>
         </w:tc>
@@ -10768,7 +10703,7 @@
                 <w:sz w:val="19"/>
                 <w:szCs w:val="19"/>
               </w:rPr>
-              <w:t xml:space="preserve">P2</w:t>
+              <w:t>P2</w:t>
             </w:r>
           </w:p>
         </w:tc>
@@ -10795,7 +10730,7 @@
                 <w:sz w:val="19"/>
                 <w:szCs w:val="19"/>
               </w:rPr>
-              <w:t xml:space="preserve">Una línea mal escrita se saltea y se informa con su archivo y línea; antes impedía abrir el sistema (RF-33).</w:t>
+              <w:t>Una línea mal escrita se saltea y se informa con su archivo y línea; antes impedía abrir el sistema (RF-33).</w:t>
             </w:r>
           </w:p>
         </w:tc>
@@ -10830,7 +10765,7 @@
                 <w:sz w:val="19"/>
                 <w:szCs w:val="19"/>
               </w:rPr>
-              <w:t xml:space="preserve">P3</w:t>
+              <w:t>P3</w:t>
             </w:r>
           </w:p>
         </w:tc>
@@ -10857,7 +10792,7 @@
                 <w:sz w:val="19"/>
                 <w:szCs w:val="19"/>
               </w:rPr>
-              <w:t xml:space="preserve">Los datos que apuntan a algo que no existe se informan (antes se descartaban sin aviso), y antes de guardar se advierte que esas líneas se van a perder (RF-34).</w:t>
+              <w:t>Los datos que apuntan a algo que no existe se informan (antes se descartaban sin aviso), y antes de guardar se advierte que esas líneas se van a perder (RF-34).</w:t>
             </w:r>
           </w:p>
         </w:tc>
@@ -10892,7 +10827,7 @@
                 <w:sz w:val="19"/>
                 <w:szCs w:val="19"/>
               </w:rPr>
-              <w:t xml:space="preserve">P4</w:t>
+              <w:t>P4</w:t>
             </w:r>
           </w:p>
         </w:tc>
@@ -10919,7 +10854,7 @@
                 <w:sz w:val="19"/>
                 <w:szCs w:val="19"/>
               </w:rPr>
-              <w:t xml:space="preserve">Al cerrar, el sistema espera a que termine el guardado y, si falla, se puede elegir no salir (RF-34).</w:t>
+              <w:t>Al cerrar, el sistema espera a que termine el guardado y, si falla, se puede elegir no salir (RF-34).</w:t>
             </w:r>
           </w:p>
         </w:tc>
@@ -10954,7 +10889,7 @@
                 <w:sz w:val="19"/>
                 <w:szCs w:val="19"/>
               </w:rPr>
-              <w:t xml:space="preserve">P5</w:t>
+              <w:t>P5</w:t>
             </w:r>
           </w:p>
         </w:tc>
@@ -10981,7 +10916,7 @@
                 <w:sz w:val="19"/>
                 <w:szCs w:val="19"/>
               </w:rPr>
-              <w:t xml:space="preserve">Se guardan los 14 tipos de datos; antes las ediciones, secciones, funciones, entradas, abonos y votos se perdían al cerrar.</w:t>
+              <w:t>Se guardan los 14 tipos de datos; antes las ediciones, secciones, funciones, entradas, abonos y votos se perdían al cerrar.</w:t>
             </w:r>
           </w:p>
         </w:tc>
@@ -11016,7 +10951,7 @@
                 <w:sz w:val="19"/>
                 <w:szCs w:val="19"/>
               </w:rPr>
-              <w:t xml:space="preserve">P6</w:t>
+              <w:t>P6</w:t>
             </w:r>
           </w:p>
         </w:tc>
@@ -11043,7 +10978,7 @@
                 <w:sz w:val="19"/>
                 <w:szCs w:val="19"/>
               </w:rPr>
-              <w:t xml:space="preserve">Las relaciones se guardan por email, título o código, en lugar de por nombre.</w:t>
+              <w:t>Las relaciones se guardan por email, título o código, en lugar de por nombre.</w:t>
             </w:r>
           </w:p>
         </w:tc>
@@ -11078,7 +11013,8 @@
                 <w:sz w:val="19"/>
                 <w:szCs w:val="19"/>
               </w:rPr>
-              <w:t xml:space="preserve">P7</w:t>
+              <w:lastRenderedPageBreak/>
+              <w:t>P7</w:t>
             </w:r>
           </w:p>
         </w:tc>
@@ -11105,7 +11041,7 @@
                 <w:sz w:val="19"/>
                 <w:szCs w:val="19"/>
               </w:rPr>
-              <w:t xml:space="preserve">Los campos se separan con ";" y los textos que lo contienen van entre comillas; antes una coma en un título rompía el archivo.</w:t>
+              <w:t>Los campos se separan con ";" y los textos que lo contienen van entre comillas; antes una coma en un título rompía el archivo.</w:t>
             </w:r>
           </w:p>
         </w:tc>
@@ -11140,7 +11076,7 @@
                 <w:sz w:val="19"/>
                 <w:szCs w:val="19"/>
               </w:rPr>
-              <w:t xml:space="preserve">P8</w:t>
+              <w:t>P8</w:t>
             </w:r>
           </w:p>
         </w:tc>
@@ -11167,7 +11103,7 @@
                 <w:sz w:val="19"/>
                 <w:szCs w:val="19"/>
               </w:rPr>
-              <w:t xml:space="preserve">Cada archivo se escribe primero en un archivo temporal, así un error no lo deja a medias.</w:t>
+              <w:t>Cada archivo se escribe primero en un archivo temporal, así un error no lo deja a medias.</w:t>
             </w:r>
           </w:p>
         </w:tc>
@@ -11202,7 +11138,7 @@
                 <w:sz w:val="19"/>
                 <w:szCs w:val="19"/>
               </w:rPr>
-              <w:t xml:space="preserve">P9</w:t>
+              <w:t>P9</w:t>
             </w:r>
           </w:p>
         </w:tc>
@@ -11229,7 +11165,7 @@
                 <w:sz w:val="19"/>
                 <w:szCs w:val="19"/>
               </w:rPr>
-              <w:t xml:space="preserve">El guardado en segundo plano ya no recorre las listas mientras la interfaz las modifica.</w:t>
+              <w:t>El guardado en segundo plano ya no recorre las listas mientras la interfaz las modifica.</w:t>
             </w:r>
           </w:p>
         </w:tc>
@@ -11264,7 +11200,7 @@
                 <w:sz w:val="19"/>
                 <w:szCs w:val="19"/>
               </w:rPr>
-              <w:t xml:space="preserve">P10</w:t>
+              <w:t>P10</w:t>
             </w:r>
           </w:p>
         </w:tc>
@@ -11291,7 +11227,7 @@
                 <w:sz w:val="19"/>
                 <w:szCs w:val="19"/>
               </w:rPr>
-              <w:t xml:space="preserve">Los errores de archivos conservan la causa original y la lista de errores encontrados.</w:t>
+              <w:t>Los errores de archivos conservan la causa original y la lista de errores encontrados.</w:t>
             </w:r>
           </w:p>
         </w:tc>
@@ -11326,7 +11262,7 @@
                 <w:sz w:val="19"/>
                 <w:szCs w:val="19"/>
               </w:rPr>
-              <w:t xml:space="preserve">P11</w:t>
+              <w:t>P11</w:t>
             </w:r>
           </w:p>
         </w:tc>
@@ -11353,7 +11289,7 @@
                 <w:sz w:val="19"/>
                 <w:szCs w:val="19"/>
               </w:rPr>
-              <w:t xml:space="preserve">Los archivos están en una carpeta fija (datos/) y se leen y escriben en UTF-8.</w:t>
+              <w:t>Los archivos están en una carpeta fija (datos/) y se leen y escriben en UTF-8.</w:t>
             </w:r>
           </w:p>
         </w:tc>
@@ -11388,7 +11324,7 @@
                 <w:sz w:val="19"/>
                 <w:szCs w:val="19"/>
               </w:rPr>
-              <w:t xml:space="preserve">P12</w:t>
+              <w:t>P12</w:t>
             </w:r>
           </w:p>
         </w:tc>
@@ -11415,7 +11351,7 @@
                 <w:sz w:val="19"/>
                 <w:szCs w:val="19"/>
               </w:rPr>
-              <w:t xml:space="preserve">La lectura y escritura de archivos está en un solo lugar, sin código repetido por cada tipo de dato.</w:t>
+              <w:t>La lectura y escritura de archivos está en un solo lugar, sin código repetido por cada tipo de dato.</w:t>
             </w:r>
           </w:p>
         </w:tc>
@@ -11450,7 +11386,7 @@
                 <w:sz w:val="19"/>
                 <w:szCs w:val="19"/>
               </w:rPr>
-              <w:t xml:space="preserve">P13</w:t>
+              <w:t>P13</w:t>
             </w:r>
           </w:p>
         </w:tc>
@@ -11477,7 +11413,7 @@
                 <w:sz w:val="19"/>
                 <w:szCs w:val="19"/>
               </w:rPr>
-              <w:t xml:space="preserve">Se corrigieron los datos: una evaluación repetida y largometrajes que estaban en la sección Cortometraje.</w:t>
+              <w:t>Se corrigieron los datos: una evaluación repetida y largometrajes que estaban en la sección Cortometraje.</w:t>
             </w:r>
           </w:p>
         </w:tc>
@@ -11487,11 +11423,11 @@
       <w:pPr>
         <w:pStyle w:val="Heading2"/>
       </w:pPr>
-      <w:bookmarkStart w:id="126" w:name="_TocSegundaEntrega3"/>
+      <w:bookmarkStart w:id="25" w:name="_Toc243836824"/>
       <w:r>
-        <w:t xml:space="preserve">7.3 Organización y calidad del código</w:t>
+        <w:t>7.3 Organización y calidad del código</w:t>
       </w:r>
-      <w:bookmarkEnd w:id="126"/>
+      <w:bookmarkEnd w:id="25"/>
     </w:p>
     <w:tbl>
       <w:tblPr>
@@ -11544,7 +11480,7 @@
                 <w:sz w:val="19"/>
                 <w:szCs w:val="19"/>
               </w:rPr>
-              <w:t xml:space="preserve">Código</w:t>
+              <w:t>Código</w:t>
             </w:r>
           </w:p>
         </w:tc>
@@ -11574,7 +11510,7 @@
                 <w:sz w:val="19"/>
                 <w:szCs w:val="19"/>
               </w:rPr>
-              <w:t xml:space="preserve">Corrección</w:t>
+              <w:t>Corrección</w:t>
             </w:r>
           </w:p>
         </w:tc>
@@ -11609,7 +11545,7 @@
                 <w:sz w:val="19"/>
                 <w:szCs w:val="19"/>
               </w:rPr>
-              <w:t xml:space="preserve">S1</w:t>
+              <w:t>S1</w:t>
             </w:r>
           </w:p>
         </w:tc>
@@ -11636,7 +11572,7 @@
                 <w:sz w:val="19"/>
                 <w:szCs w:val="19"/>
               </w:rPr>
-              <w:t xml:space="preserve">EntradaServicio se dividió en FuncionServicio, VentaServicio y AbonoServicio.</w:t>
+              <w:t>EntradaServicio se dividió en FuncionServicio, VentaServicio y AbonoServicio.</w:t>
             </w:r>
           </w:p>
         </w:tc>
@@ -11671,7 +11607,7 @@
                 <w:sz w:val="19"/>
                 <w:szCs w:val="19"/>
               </w:rPr>
-              <w:t xml:space="preserve">S2</w:t>
+              <w:t>S2</w:t>
             </w:r>
           </w:p>
         </w:tc>
@@ -11698,7 +11634,7 @@
                 <w:sz w:val="19"/>
                 <w:szCs w:val="19"/>
               </w:rPr>
-              <w:t xml:space="preserve">PeliculaServicio se dividió en PeliculaServicio, PersonaServicio y EvaluacionServicio.</w:t>
+              <w:t>PeliculaServicio se dividió en PeliculaServicio, PersonaServicio y EvaluacionServicio.</w:t>
             </w:r>
           </w:p>
         </w:tc>
@@ -11733,7 +11669,7 @@
                 <w:sz w:val="19"/>
                 <w:szCs w:val="19"/>
               </w:rPr>
-              <w:t xml:space="preserve">S3</w:t>
+              <w:t>S3</w:t>
             </w:r>
           </w:p>
         </w:tc>
@@ -11760,7 +11696,7 @@
                 <w:sz w:val="19"/>
                 <w:szCs w:val="19"/>
               </w:rPr>
-              <w:t xml:space="preserve">Los instanceof se reemplazaron por métodos abstractos: cada función responde su precio, tipo y lugar, y cada entrada su detalle y cómo liberar su lugar.</w:t>
+              <w:t>Los instanceof se reemplazaron por métodos abstractos: cada función responde su precio, tipo y lugar, y cada entrada su detalle y cómo liberar su lugar.</w:t>
             </w:r>
           </w:p>
         </w:tc>
@@ -11795,7 +11731,7 @@
                 <w:sz w:val="19"/>
                 <w:szCs w:val="19"/>
               </w:rPr>
-              <w:t xml:space="preserve">S4</w:t>
+              <w:t>S4</w:t>
             </w:r>
           </w:p>
         </w:tc>
@@ -11822,7 +11758,7 @@
                 <w:sz w:val="19"/>
                 <w:szCs w:val="19"/>
               </w:rPr>
-              <w:t xml:space="preserve">El género y el tipo de abono son enums (Genero y TipoAbono) en lugar de textos.</w:t>
+              <w:t>El género y el tipo de abono son enums (Genero y TipoAbono) en lugar de textos.</w:t>
             </w:r>
           </w:p>
         </w:tc>
@@ -11857,7 +11793,7 @@
                 <w:sz w:val="19"/>
                 <w:szCs w:val="19"/>
               </w:rPr>
-              <w:t xml:space="preserve">S5</w:t>
+              <w:t>S5</w:t>
             </w:r>
           </w:p>
         </w:tc>
@@ -11884,7 +11820,7 @@
                 <w:sz w:val="19"/>
                 <w:szCs w:val="19"/>
               </w:rPr>
-              <w:t xml:space="preserve">Los métodos de búsqueda ya no devuelven null: lanzan una excepción y hay métodos para preguntar antes.</w:t>
+              <w:t>Los métodos de búsqueda ya no devuelven null: lanzan una excepción y hay métodos para preguntar antes.</w:t>
             </w:r>
           </w:p>
         </w:tc>
@@ -11919,7 +11855,7 @@
                 <w:sz w:val="19"/>
                 <w:szCs w:val="19"/>
               </w:rPr>
-              <w:t xml:space="preserve">S6</w:t>
+              <w:t>S6</w:t>
             </w:r>
           </w:p>
         </w:tc>
@@ -11946,7 +11882,7 @@
                 <w:sz w:val="19"/>
                 <w:szCs w:val="19"/>
               </w:rPr>
-              <w:t xml:space="preserve">Excepciones específicas en lugar de una sola genérica; la interfaz distingue los errores de negocio de los errores inesperados.</w:t>
+              <w:t>Excepciones específicas en lugar de una sola genérica; la interfaz distingue los errores de negocio de los errores inesperados.</w:t>
             </w:r>
           </w:p>
         </w:tc>
@@ -11981,7 +11917,7 @@
                 <w:sz w:val="19"/>
                 <w:szCs w:val="19"/>
               </w:rPr>
-              <w:t xml:space="preserve">S7</w:t>
+              <w:t>S7</w:t>
             </w:r>
           </w:p>
         </w:tc>
@@ -12008,7 +11944,7 @@
                 <w:sz w:val="19"/>
                 <w:szCs w:val="19"/>
               </w:rPr>
-              <w:t xml:space="preserve">Las reglas de negocio que estaban en los paneles pasaron al modelo y a los servicios.</w:t>
+              <w:t>Las reglas de negocio que estaban en los paneles pasaron al modelo y a los servicios.</w:t>
             </w:r>
           </w:p>
         </w:tc>
@@ -12043,7 +11979,7 @@
                 <w:sz w:val="19"/>
                 <w:szCs w:val="19"/>
               </w:rPr>
-              <w:t xml:space="preserve">S8</w:t>
+              <w:t>S8</w:t>
             </w:r>
           </w:p>
         </w:tc>
@@ -12070,7 +12006,7 @@
                 <w:sz w:val="19"/>
                 <w:szCs w:val="19"/>
               </w:rPr>
-              <w:t xml:space="preserve">Los diálogos largos salieron de los paneles a clases propias, y se unificaron el formulario de persona y la lectura de los campos.</w:t>
+              <w:t>Los diálogos largos salieron de los paneles a clases propias, y se unificaron el formulario de persona y la lectura de los campos.</w:t>
             </w:r>
           </w:p>
         </w:tc>
@@ -12105,7 +12041,7 @@
                 <w:sz w:val="19"/>
                 <w:szCs w:val="19"/>
               </w:rPr>
-              <w:t xml:space="preserve">S9</w:t>
+              <w:t>S9</w:t>
             </w:r>
           </w:p>
         </w:tc>
@@ -12132,7 +12068,7 @@
                 <w:sz w:val="19"/>
                 <w:szCs w:val="19"/>
               </w:rPr>
-              <w:t xml:space="preserve">Cada panel recibe solo los servicios que usa, en lugar de la ventana principal entera.</w:t>
+              <w:t>Cada panel recibe solo los servicios que usa, en lugar de la ventana principal entera.</w:t>
             </w:r>
           </w:p>
         </w:tc>
@@ -12167,7 +12103,7 @@
                 <w:sz w:val="19"/>
                 <w:szCs w:val="19"/>
               </w:rPr>
-              <w:t xml:space="preserve">S10</w:t>
+              <w:t>S10</w:t>
             </w:r>
           </w:p>
         </w:tc>
@@ -12194,7 +12130,7 @@
                 <w:sz w:val="19"/>
                 <w:szCs w:val="19"/>
               </w:rPr>
-              <w:t xml:space="preserve">Los combos y las tablas trabajan con objetos o códigos, no con la posición de la fila.</w:t>
+              <w:t>Los combos y las tablas trabajan con objetos o códigos, no con la posición de la fila.</w:t>
             </w:r>
           </w:p>
         </w:tc>
@@ -12229,7 +12165,7 @@
                 <w:sz w:val="19"/>
                 <w:szCs w:val="19"/>
               </w:rPr>
-              <w:t xml:space="preserve">S13 a S16</w:t>
+              <w:t>S13 a S16</w:t>
             </w:r>
           </w:p>
         </w:tc>
@@ -12256,7 +12192,7 @@
                 <w:sz w:val="19"/>
                 <w:szCs w:val="19"/>
               </w:rPr>
-              <w:t xml:space="preserve">Se simplificaron cadenas de getters, búsquedas repetidas en los datos de ejemplo, comparaciones con == y código que no se usaba.</w:t>
+              <w:t>Se simplificaron cadenas de getters, búsquedas repetidas en los datos de ejemplo, comparaciones con == y código que no se usaba.</w:t>
             </w:r>
           </w:p>
         </w:tc>
@@ -12291,7 +12227,7 @@
                 <w:sz w:val="19"/>
                 <w:szCs w:val="19"/>
               </w:rPr>
-              <w:t xml:space="preserve">B1</w:t>
+              <w:t>B1</w:t>
             </w:r>
           </w:p>
         </w:tc>
@@ -12318,7 +12254,7 @@
                 <w:sz w:val="19"/>
                 <w:szCs w:val="19"/>
               </w:rPr>
-              <w:t xml:space="preserve">Los datos de ejemplo asignaban entradas a la función equivocada.</w:t>
+              <w:t>Los datos de ejemplo asignaban entradas a la función equivocada.</w:t>
             </w:r>
           </w:p>
         </w:tc>
@@ -12353,7 +12289,7 @@
                 <w:sz w:val="19"/>
                 <w:szCs w:val="19"/>
               </w:rPr>
-              <w:t xml:space="preserve">B2</w:t>
+              <w:t>B2</w:t>
             </w:r>
           </w:p>
         </w:tc>
@@ -12380,7 +12316,7 @@
                 <w:sz w:val="19"/>
                 <w:szCs w:val="19"/>
               </w:rPr>
-              <w:t xml:space="preserve">Los buscadores de las tablas fallaban al escribir "(" o "[".</w:t>
+              <w:t>Los buscadores de las tablas fallaban al escribir "(" o "[".</w:t>
             </w:r>
           </w:p>
         </w:tc>
@@ -12390,11 +12326,11 @@
       <w:pPr>
         <w:pStyle w:val="Heading2"/>
       </w:pPr>
-      <w:bookmarkStart w:id="127" w:name="_TocSegundaEntrega4"/>
+      <w:bookmarkStart w:id="26" w:name="_Toc243836825"/>
       <w:r>
-        <w:t xml:space="preserve">7.4 Pendiente para la tercera entrega</w:t>
+        <w:t>7.4 Pendiente para la tercera entrega</w:t>
       </w:r>
-      <w:bookmarkEnd w:id="127"/>
+      <w:bookmarkEnd w:id="26"/>
     </w:p>
     <w:p>
       <w:pPr>
@@ -12406,7 +12342,7 @@
         <w:spacing w:after="60"/>
       </w:pPr>
       <w:r>
-        <w:t xml:space="preserve">Aplicar patrones de diseño.</w:t>
+        <w:t>Aplicar patrones de diseño.</w:t>
       </w:r>
     </w:p>
     <w:p>
@@ -12419,7 +12355,7 @@
         <w:spacing w:after="60"/>
       </w:pPr>
       <w:r>
-        <w:t xml:space="preserve">Reemplazar el instanceof que queda en el método cubre() de los abonos.</w:t>
+        <w:t>Reemplazar el instanceof que queda en el método cubre() de los abonos.</w:t>
       </w:r>
     </w:p>
     <w:p>
@@ -12432,44 +12368,25 @@
         <w:spacing w:after="60"/>
       </w:pPr>
       <w:r>
-        <w:t xml:space="preserve">Usar BigDecimal para los precios en lugar de double.</w:t>
+        <w:t>Agregar tests unitarios.</w:t>
       </w:r>
     </w:p>
     <w:p>
       <w:pPr>
         <w:pStyle w:val="ListParagraph"/>
-        <w:numPr>
-          <w:ilvl w:val="0"/>
-          <w:numId w:val="2"/>
-        </w:numPr>
         <w:spacing w:after="60"/>
+        <w:ind w:left="720"/>
       </w:pPr>
-      <w:r>
-        <w:t xml:space="preserve">Agregar tests unitarios.</w:t>
-      </w:r>
-    </w:p>
-    <w:p>
-      <w:pPr>
-        <w:pStyle w:val="ListParagraph"/>
-        <w:numPr>
-          <w:ilvl w:val="0"/>
-          <w:numId w:val="2"/>
-        </w:numPr>
-        <w:spacing w:after="60"/>
-      </w:pPr>
-      <w:r>
-        <w:t xml:space="preserve">Actualizar el diagrama UML a la segunda entrega.</w:t>
-      </w:r>
     </w:p>
     <w:p>
       <w:pPr>
         <w:pStyle w:val="Heading1"/>
       </w:pPr>
-      <w:bookmarkStart w:id="22" w:name="_Toc242618236"/>
+      <w:bookmarkStart w:id="27" w:name="_Toc243836826"/>
       <w:r>
         <w:t>8. Supuestos y limitaciones</w:t>
       </w:r>
-      <w:bookmarkEnd w:id="22"/>
+      <w:bookmarkEnd w:id="27"/>
     </w:p>
     <w:p>
       <w:pPr>
@@ -12494,7 +12411,8 @@
         <w:spacing w:after="60"/>
       </w:pPr>
       <w:r>
-        <w:t xml:space="preserve">Se persisten todos los datos en la carpeta datos/. Los datos de ejemplo (ediciones, secciones, funciones, entradas, abonos y votos) los carga la clase InicializadorDatos solo la primera vez, cuando todavía no hay ediciones guardadas.</w:t>
+        <w:lastRenderedPageBreak/>
+        <w:t>Se persisten todos los datos en la carpeta datos/. Los datos de ejemplo (ediciones, secciones, funciones, entradas, abonos y votos) los carga la clase InicializadorDatos solo la primera vez, cuando todavía no hay ediciones guardadas.</w:t>
       </w:r>
     </w:p>
     <w:p>
@@ -12507,7 +12425,7 @@
         <w:spacing w:after="60"/>
       </w:pPr>
       <w:r>
-        <w:t xml:space="preserve">El sistema se ejecuta desde la carpeta raíz del proyecto, donde está la carpeta datos/.</w:t>
+        <w:t>El sistema se ejecuta desde la carpeta raíz del proyecto, donde está la carpeta datos/.</w:t>
       </w:r>
     </w:p>
     <w:p>
@@ -12527,18 +12445,18 @@
       <w:pPr>
         <w:pStyle w:val="Heading1"/>
       </w:pPr>
-      <w:bookmarkStart w:id="23" w:name="_Toc242618237"/>
+      <w:bookmarkStart w:id="28" w:name="_Toc243836827"/>
       <w:r>
         <w:t>9. Modelo de clases</w:t>
       </w:r>
-      <w:bookmarkEnd w:id="23"/>
+      <w:bookmarkEnd w:id="28"/>
     </w:p>
     <w:p>
       <w:pPr>
         <w:spacing w:after="120"/>
       </w:pPr>
       <w:r>
-        <w:t xml:space="preserve">El diseño del sistema se documenta en el diagrama de clases UML entregado en el archivo uml/FestivalCine.mdj (StarUML). El diagrama corresponde a la primera entrega: contiene sus 52 clases organizadas en paquetes, más las clases de Java de las que heredan (RuntimeException, Exception, JFrame y JPanel). La actualización del diagrama a la segunda entrega está pendiente.</w:t>
+        <w:t>El diseño del sistema se documenta en el diagrama de clases UML entregado en el archivo uml/FestivalCine.mdj (StarUML). El diagrama corresponde a la primera entrega: contiene sus 52 clases organizadas en paquetes, más las clases de Java de las que heredan (RuntimeException, Exception, JFrame y JPanel). La actualización del diagrama a la segunda entrega está pendiente.</w:t>
       </w:r>
     </w:p>
     <w:p>
@@ -12546,7 +12464,7 @@
         <w:spacing w:after="120"/>
       </w:pPr>
       <w:r>
-        <w:t xml:space="preserve">El archivo incluye un único diagrama con todas las clases y relaciones de la primera entrega, que consiste en:</w:t>
+        <w:t>El archivo incluye un único diagrama con todas las clases y relaciones de la primera entrega, que consiste en:</w:t>
       </w:r>
     </w:p>
     <w:p>
@@ -12587,23 +12505,7 @@
           <w:b/>
           <w:bCs/>
         </w:rPr>
-        <w:t xml:space="preserve">Servicios, persistencia y </w:t>
-      </w:r>
-      <w:proofErr w:type="gramStart"/>
-      <w:r>
-        <w:rPr>
-          <w:b/>
-          <w:bCs/>
-        </w:rPr>
-        <w:t>app</w:t>
-      </w:r>
-      <w:proofErr w:type="gramEnd"/>
-      <w:r>
-        <w:rPr>
-          <w:b/>
-          <w:bCs/>
-        </w:rPr>
-        <w:t xml:space="preserve">: </w:t>
+        <w:t xml:space="preserve">Servicios, persistencia y app: </w:t>
       </w:r>
       <w:r>
         <w:t>la lógica de negocio, la persistencia en archivos y la clase principal.</w:t>
@@ -12623,23 +12525,7 @@
           <w:b/>
           <w:bCs/>
         </w:rPr>
-        <w:t>Interfaz (</w:t>
-      </w:r>
-      <w:proofErr w:type="spellStart"/>
-      <w:r>
-        <w:rPr>
-          <w:b/>
-          <w:bCs/>
-        </w:rPr>
-        <w:t>ui</w:t>
-      </w:r>
-      <w:proofErr w:type="spellEnd"/>
-      <w:r>
-        <w:rPr>
-          <w:b/>
-          <w:bCs/>
-        </w:rPr>
-        <w:t xml:space="preserve">): </w:t>
+        <w:t xml:space="preserve">Interfaz (ui): </w:t>
       </w:r>
       <w:r>
         <w:t>la ventana principal y los 12 paneles Swing.</w:t>
@@ -12670,7 +12556,7 @@
         <w:spacing w:after="120"/>
       </w:pPr>
       <w:r>
-        <w:t xml:space="preserve">Con las correcciones de la segunda entrega, el proyecto pasó a tener 77 tipos (73 clases y 4 enums): 28 en el modelo, 11 excepciones, 9 en servicios, 4 en persistencia, la clase principal y 24 en la interfaz (la ventana principal, 12 paneles, 8 diálogos y 3 clases comunes). En la sección 7 se detallan los cambios.</w:t>
+        <w:t>Con las correcciones de la segunda entrega, el proyecto pasó a tener 77 tipos (73 clases y 4 enums): 28 en el modelo, 11 excepciones, 9 en servicios, 4 en persistencia, la clase principal y 24 en la interfaz (la ventana principal, 12 paneles, 8 diálogos y 3 clases comunes). En la sección 7 se detallan los cambios.</w:t>
       </w:r>
     </w:p>
     <w:sectPr>

</xml_diff>